<commit_message>
Finalize published analytics deliverables
</commit_message>
<xml_diff>
--- a/docs/downloads/PowerBI_Project_Report.docx
+++ b/docs/downloads/PowerBI_Project_Report.docx
@@ -13,11 +13,9 @@
         </w:rPr>
         <w:t>Data Analysis and Reporting Using Power BI</w:t>
         <w:br/>
-        <w:t>University Academic Performance, Enrollment, Attendance, Financial, and Department Analytics</w:t>
+        <w:t>University Academic Analytics</w:t>
         <w:br/>
         <w:t>Student Information: [Name / ID placeholders]</w:t>
-        <w:br/>
-        <w:t>Course Information: [Course / section placeholders]</w:t>
       </w:r>
     </w:p>
     <w:p>
@@ -29,59 +27,8 @@
       </w:r>
     </w:p>
     <w:p>
-      <w:pPr>
-        <w:jc w:val="both"/>
-      </w:pPr>
       <w:r>
-        <w:t>This project creates a complete synthetic university analytics package for Power BI. It includes raw and cleaned datasets, Python generation and validation scripts, data dictionary, relationship documentation, DAX and Power Query libraries, dashboard specifications, report, presentation, and GitHub publication. The cleaned dataset contains 1,000 students, 10 departments, 70 courses, 50 faculty members, 12,500 enrollment records, 22,577 attendance records, and 5,994 payment records.</w:t>
-      </w:r>
-    </w:p>
-    <w:p>
-      <w:pPr>
-        <w:pStyle w:val="Heading1"/>
-      </w:pPr>
-      <w:r>
-        <w:t>Introduction</w:t>
-      </w:r>
-    </w:p>
-    <w:p>
-      <w:pPr>
-        <w:jc w:val="both"/>
-      </w:pPr>
-      <w:r>
-        <w:t>Universities need integrated reporting across enrollment, performance, attendance, payments, faculty workload, and budget utilization. This project demonstrates how related academic tables can be modeled and transformed for a management dashboard in Power BI.</w:t>
-      </w:r>
-    </w:p>
-    <w:p>
-      <w:pPr>
-        <w:pStyle w:val="Heading1"/>
-      </w:pPr>
-      <w:r>
-        <w:t>Problem Statement</w:t>
-      </w:r>
-    </w:p>
-    <w:p>
-      <w:pPr>
-        <w:jc w:val="both"/>
-      </w:pPr>
-      <w:r>
-        <w:t>University management often receives fragmented data from student, academic, finance, and departmental systems. The project addresses this by designing a relational dataset and Power BI-ready semantic model for multi-perspective analytics.</w:t>
-      </w:r>
-    </w:p>
-    <w:p>
-      <w:pPr>
-        <w:pStyle w:val="Heading1"/>
-      </w:pPr>
-      <w:r>
-        <w:t>Project Objectives</w:t>
-      </w:r>
-    </w:p>
-    <w:p>
-      <w:pPr>
-        <w:jc w:val="both"/>
-      </w:pPr>
-      <w:r>
-        <w:t>The objectives are to import and transform multi-table data, define one-to-one, one-to-many, and bridge-resolved many-to-many relationships, create analytical measures, specify meaningful dashboards, and document findings and limitations.</w:t>
+        <w:t>This submission contains a validated synthetic university analytics dataset, Power BI-ready documentation, a public static analytics viewer, demo video, formal report, presentation, and GitHub release. The cleaned dataset contains 1,000 students, 12,500 enrollments, 22,577 attendance records, and 5,994 payment records.</w:t>
       </w:r>
     </w:p>
     <w:p>
@@ -93,16 +40,8 @@
       </w:r>
     </w:p>
     <w:p>
-      <w:pPr>
-        <w:jc w:val="both"/>
-      </w:pPr>
       <w:r>
-        <w:t>The dataset covers academic years 2023 to 2026 and is entirely fictional. It contains raw data with controlled quality problems and cleaned data suitable for Power BI modeling. Raw and cleaned workbooks are stored separately and are also exported as individual CSV files.</w:t>
-      </w:r>
-    </w:p>
-    <w:p>
-      <w:r>
-        <w:t>Table 1: Dataset row counts</w:t>
+        <w:t>The dataset covers 2023 to 2026 and contains separate raw and cleaned versions. Raw data includes controlled quality issues; cleaned data is validated and exported as Excel and CSV files.</w:t>
       </w:r>
     </w:p>
     <w:tbl>
@@ -112,14 +51,14 @@
         <w:tblLook w:firstColumn="1" w:firstRow="1" w:lastColumn="0" w:lastRow="0" w:noHBand="0" w:noVBand="1" w:val="04A0"/>
       </w:tblPr>
       <w:tblGrid>
-        <w:gridCol w:w="3120"/>
-        <w:gridCol w:w="3120"/>
-        <w:gridCol w:w="3120"/>
+        <w:gridCol w:w="2880"/>
+        <w:gridCol w:w="2880"/>
+        <w:gridCol w:w="2880"/>
       </w:tblGrid>
       <w:tr>
         <w:tc>
           <w:tcPr>
-            <w:tcW w:type="dxa" w:w="3120"/>
+            <w:tcW w:type="dxa" w:w="2880"/>
           </w:tcPr>
           <w:p>
             <w:r>
@@ -129,7 +68,7 @@
         </w:tc>
         <w:tc>
           <w:tcPr>
-            <w:tcW w:type="dxa" w:w="3120"/>
+            <w:tcW w:type="dxa" w:w="2880"/>
           </w:tcPr>
           <w:p>
             <w:r>
@@ -139,7 +78,7 @@
         </w:tc>
         <w:tc>
           <w:tcPr>
-            <w:tcW w:type="dxa" w:w="3120"/>
+            <w:tcW w:type="dxa" w:w="2880"/>
           </w:tcPr>
           <w:p>
             <w:r>
@@ -151,7 +90,7 @@
       <w:tr>
         <w:tc>
           <w:tcPr>
-            <w:tcW w:type="dxa" w:w="3120"/>
+            <w:tcW w:type="dxa" w:w="2880"/>
           </w:tcPr>
           <w:p>
             <w:r>
@@ -161,7 +100,7 @@
         </w:tc>
         <w:tc>
           <w:tcPr>
-            <w:tcW w:type="dxa" w:w="3120"/>
+            <w:tcW w:type="dxa" w:w="2880"/>
           </w:tcPr>
           <w:p>
             <w:r>
@@ -171,7 +110,7 @@
         </w:tc>
         <w:tc>
           <w:tcPr>
-            <w:tcW w:type="dxa" w:w="3120"/>
+            <w:tcW w:type="dxa" w:w="2880"/>
           </w:tcPr>
           <w:p>
             <w:r>
@@ -183,7 +122,7 @@
       <w:tr>
         <w:tc>
           <w:tcPr>
-            <w:tcW w:type="dxa" w:w="3120"/>
+            <w:tcW w:type="dxa" w:w="2880"/>
           </w:tcPr>
           <w:p>
             <w:r>
@@ -193,7 +132,7 @@
         </w:tc>
         <w:tc>
           <w:tcPr>
-            <w:tcW w:type="dxa" w:w="3120"/>
+            <w:tcW w:type="dxa" w:w="2880"/>
           </w:tcPr>
           <w:p>
             <w:r>
@@ -203,7 +142,7 @@
         </w:tc>
         <w:tc>
           <w:tcPr>
-            <w:tcW w:type="dxa" w:w="3120"/>
+            <w:tcW w:type="dxa" w:w="2880"/>
           </w:tcPr>
           <w:p>
             <w:r>
@@ -215,7 +154,7 @@
       <w:tr>
         <w:tc>
           <w:tcPr>
-            <w:tcW w:type="dxa" w:w="3120"/>
+            <w:tcW w:type="dxa" w:w="2880"/>
           </w:tcPr>
           <w:p>
             <w:r>
@@ -225,7 +164,7 @@
         </w:tc>
         <w:tc>
           <w:tcPr>
-            <w:tcW w:type="dxa" w:w="3120"/>
+            <w:tcW w:type="dxa" w:w="2880"/>
           </w:tcPr>
           <w:p>
             <w:r>
@@ -235,7 +174,7 @@
         </w:tc>
         <w:tc>
           <w:tcPr>
-            <w:tcW w:type="dxa" w:w="3120"/>
+            <w:tcW w:type="dxa" w:w="2880"/>
           </w:tcPr>
           <w:p>
             <w:r>
@@ -247,7 +186,7 @@
       <w:tr>
         <w:tc>
           <w:tcPr>
-            <w:tcW w:type="dxa" w:w="3120"/>
+            <w:tcW w:type="dxa" w:w="2880"/>
           </w:tcPr>
           <w:p>
             <w:r>
@@ -257,7 +196,7 @@
         </w:tc>
         <w:tc>
           <w:tcPr>
-            <w:tcW w:type="dxa" w:w="3120"/>
+            <w:tcW w:type="dxa" w:w="2880"/>
           </w:tcPr>
           <w:p>
             <w:r>
@@ -267,7 +206,7 @@
         </w:tc>
         <w:tc>
           <w:tcPr>
-            <w:tcW w:type="dxa" w:w="3120"/>
+            <w:tcW w:type="dxa" w:w="2880"/>
           </w:tcPr>
           <w:p>
             <w:r>
@@ -279,7 +218,7 @@
       <w:tr>
         <w:tc>
           <w:tcPr>
-            <w:tcW w:type="dxa" w:w="3120"/>
+            <w:tcW w:type="dxa" w:w="2880"/>
           </w:tcPr>
           <w:p>
             <w:r>
@@ -289,7 +228,7 @@
         </w:tc>
         <w:tc>
           <w:tcPr>
-            <w:tcW w:type="dxa" w:w="3120"/>
+            <w:tcW w:type="dxa" w:w="2880"/>
           </w:tcPr>
           <w:p>
             <w:r>
@@ -299,7 +238,7 @@
         </w:tc>
         <w:tc>
           <w:tcPr>
-            <w:tcW w:type="dxa" w:w="3120"/>
+            <w:tcW w:type="dxa" w:w="2880"/>
           </w:tcPr>
           <w:p>
             <w:r>
@@ -311,7 +250,7 @@
       <w:tr>
         <w:tc>
           <w:tcPr>
-            <w:tcW w:type="dxa" w:w="3120"/>
+            <w:tcW w:type="dxa" w:w="2880"/>
           </w:tcPr>
           <w:p>
             <w:r>
@@ -321,7 +260,7 @@
         </w:tc>
         <w:tc>
           <w:tcPr>
-            <w:tcW w:type="dxa" w:w="3120"/>
+            <w:tcW w:type="dxa" w:w="2880"/>
           </w:tcPr>
           <w:p>
             <w:r>
@@ -331,7 +270,7 @@
         </w:tc>
         <w:tc>
           <w:tcPr>
-            <w:tcW w:type="dxa" w:w="3120"/>
+            <w:tcW w:type="dxa" w:w="2880"/>
           </w:tcPr>
           <w:p>
             <w:r>
@@ -343,7 +282,7 @@
       <w:tr>
         <w:tc>
           <w:tcPr>
-            <w:tcW w:type="dxa" w:w="3120"/>
+            <w:tcW w:type="dxa" w:w="2880"/>
           </w:tcPr>
           <w:p>
             <w:r>
@@ -353,7 +292,7 @@
         </w:tc>
         <w:tc>
           <w:tcPr>
-            <w:tcW w:type="dxa" w:w="3120"/>
+            <w:tcW w:type="dxa" w:w="2880"/>
           </w:tcPr>
           <w:p>
             <w:r>
@@ -363,7 +302,7 @@
         </w:tc>
         <w:tc>
           <w:tcPr>
-            <w:tcW w:type="dxa" w:w="3120"/>
+            <w:tcW w:type="dxa" w:w="2880"/>
           </w:tcPr>
           <w:p>
             <w:r>
@@ -375,7 +314,7 @@
       <w:tr>
         <w:tc>
           <w:tcPr>
-            <w:tcW w:type="dxa" w:w="3120"/>
+            <w:tcW w:type="dxa" w:w="2880"/>
           </w:tcPr>
           <w:p>
             <w:r>
@@ -385,7 +324,7 @@
         </w:tc>
         <w:tc>
           <w:tcPr>
-            <w:tcW w:type="dxa" w:w="3120"/>
+            <w:tcW w:type="dxa" w:w="2880"/>
           </w:tcPr>
           <w:p>
             <w:r>
@@ -395,7 +334,7 @@
         </w:tc>
         <w:tc>
           <w:tcPr>
-            <w:tcW w:type="dxa" w:w="3120"/>
+            <w:tcW w:type="dxa" w:w="2880"/>
           </w:tcPr>
           <w:p>
             <w:r>
@@ -407,7 +346,7 @@
       <w:tr>
         <w:tc>
           <w:tcPr>
-            <w:tcW w:type="dxa" w:w="3120"/>
+            <w:tcW w:type="dxa" w:w="2880"/>
           </w:tcPr>
           <w:p>
             <w:r>
@@ -417,7 +356,7 @@
         </w:tc>
         <w:tc>
           <w:tcPr>
-            <w:tcW w:type="dxa" w:w="3120"/>
+            <w:tcW w:type="dxa" w:w="2880"/>
           </w:tcPr>
           <w:p>
             <w:r>
@@ -427,7 +366,7 @@
         </w:tc>
         <w:tc>
           <w:tcPr>
-            <w:tcW w:type="dxa" w:w="3120"/>
+            <w:tcW w:type="dxa" w:w="2880"/>
           </w:tcPr>
           <w:p>
             <w:r>
@@ -439,7 +378,7 @@
       <w:tr>
         <w:tc>
           <w:tcPr>
-            <w:tcW w:type="dxa" w:w="3120"/>
+            <w:tcW w:type="dxa" w:w="2880"/>
           </w:tcPr>
           <w:p>
             <w:r>
@@ -449,7 +388,7 @@
         </w:tc>
         <w:tc>
           <w:tcPr>
-            <w:tcW w:type="dxa" w:w="3120"/>
+            <w:tcW w:type="dxa" w:w="2880"/>
           </w:tcPr>
           <w:p>
             <w:r>
@@ -459,7 +398,7 @@
         </w:tc>
         <w:tc>
           <w:tcPr>
-            <w:tcW w:type="dxa" w:w="3120"/>
+            <w:tcW w:type="dxa" w:w="2880"/>
           </w:tcPr>
           <w:p>
             <w:r>
@@ -474,100 +413,12 @@
         <w:pStyle w:val="Heading1"/>
       </w:pPr>
       <w:r>
-        <w:t>Table Descriptions</w:t>
-      </w:r>
-    </w:p>
-    <w:p>
-      <w:pPr>
-        <w:jc w:val="both"/>
-      </w:pPr>
-      <w:r>
-        <w:t>Students stores student demographic and admission attributes. StudentProfile stores one-to-one profile details. Departments, Courses, Faculty, and Semesters are dimensions. Enrollment is both transaction fact and bridge table. Attendance, Payments, and DepartmentBudget are fact tables.</w:t>
-      </w:r>
-    </w:p>
-    <w:p>
-      <w:pPr>
-        <w:pStyle w:val="Heading1"/>
-      </w:pPr>
-      <w:r>
-        <w:t>Data Dictionary</w:t>
-      </w:r>
-    </w:p>
-    <w:p>
-      <w:pPr>
-        <w:jc w:val="both"/>
-      </w:pPr>
-      <w:r>
-        <w:t>The complete data dictionary is available in documentation/University_Data_Dictionary.xlsx. It records table names, column names, data types, purpose, and null counts.</w:t>
-      </w:r>
-    </w:p>
-    <w:p>
-      <w:pPr>
-        <w:pStyle w:val="Heading1"/>
-      </w:pPr>
-      <w:r>
-        <w:t>Data Import Process</w:t>
-      </w:r>
-    </w:p>
-    <w:p>
-      <w:pPr>
-        <w:jc w:val="both"/>
-      </w:pPr>
-      <w:r>
-        <w:t>Open Power BI Desktop, select Get Data, choose Excel Workbook, select data/cleaned/University_Academic_Analytics_Cleaned.xlsx, load all worksheets, open Transform Data, review headers, confirm types, apply transformations, load data, open Model View, define relationships, hide technical identifiers where appropriate, create _Measures, create the Date table, and mark it as the official Date table.</w:t>
-      </w:r>
-    </w:p>
-    <w:p>
-      <w:pPr>
-        <w:pStyle w:val="Heading1"/>
-      </w:pPr>
-      <w:r>
-        <w:t>Data-Cleaning Process</w:t>
-      </w:r>
-    </w:p>
-    <w:p>
-      <w:pPr>
-        <w:jc w:val="both"/>
-      </w:pPr>
-      <w:r>
-        <w:t>The cleaning process standardizes text, removes duplicates, corrects data types, validates marks and attendance percentages, recalculates payment balances, fills controlled null values where appropriate, and creates academic, attendance, payment, and budget risk categories.</w:t>
-      </w:r>
-    </w:p>
-    <w:p>
-      <w:pPr>
-        <w:pStyle w:val="Heading1"/>
-      </w:pPr>
-      <w:r>
-        <w:t>Power Query Transformations</w:t>
-      </w:r>
-    </w:p>
-    <w:p>
-      <w:pPr>
-        <w:jc w:val="both"/>
-      </w:pPr>
-      <w:r>
-        <w:t>Detailed Power Query M code is provided in powerbi/Power_Query_M_Code.md. It includes promoting headers, renaming/typing columns, trimming and cleaning text, replacing inconsistent values, handling nulls, validating marks, converting text dates, calculating outstanding payments, and creating conditional categories.</w:t>
-      </w:r>
-    </w:p>
-    <w:p>
-      <w:pPr>
-        <w:pStyle w:val="Heading1"/>
-      </w:pPr>
-      <w:r>
-        <w:t>Data-Model Design</w:t>
-      </w:r>
-    </w:p>
-    <w:p>
-      <w:pPr>
-        <w:jc w:val="both"/>
-      </w:pPr>
-      <w:r>
-        <w:t>The model follows a controlled snowflake/star schema. Students, StudentProfile, Departments, Courses, Faculty, and Semesters are dimension-style tables. Enrollment, Attendance, Payments, and DepartmentBudget provide transactional and analytical facts.</w:t>
+        <w:t>Data Model and Relationships</w:t>
       </w:r>
     </w:p>
     <w:p>
       <w:r>
-        <w:t>Figure 1: Data model diagram</w:t>
+        <w:t>The model documents one-to-one Students to StudentProfile, one-to-many department/student/course/faculty/budget and transaction relationships, and the conceptual Students-Courses many-to-many relationship resolved by Enrollment.</w:t>
       </w:r>
     </w:p>
     <w:p>
@@ -611,15 +462,12 @@
         <w:pStyle w:val="Heading1"/>
       </w:pPr>
       <w:r>
-        <w:t>One-to-One Relationship</w:t>
+        <w:t>Power Query and DAX</w:t>
       </w:r>
     </w:p>
     <w:p>
-      <w:pPr>
-        <w:jc w:val="both"/>
-      </w:pPr>
       <w:r>
-        <w:t>Students[StudentID] relates to StudentProfile[StudentID]. Each StudentID appears once in both tables, allowing profile attributes to extend the student dimension without duplication.</w:t>
+        <w:t>Power Query transformations are documented table-by-table in powerbi/Power_Query_M_Code.md. The project includes 40 DAX measures, Date table DAX, and calculated-column examples.</w:t>
       </w:r>
     </w:p>
     <w:p>
@@ -627,143 +475,12 @@
         <w:pStyle w:val="Heading1"/>
       </w:pPr>
       <w:r>
-        <w:t>One-to-Many Relationships</w:t>
+        <w:t>Published Analytics</w:t>
       </w:r>
     </w:p>
     <w:p>
-      <w:pPr>
-        <w:jc w:val="both"/>
-      </w:pPr>
       <w:r>
-        <w:t>Departments filters Students, Courses, Faculty, and DepartmentBudget. Students, Courses, Semesters, and Faculty filter Enrollment. Enrollment filters Attendance. Students and Semesters filter Payments. Relationships are documented in documentation/Relationship_Documentation.md.</w:t>
-      </w:r>
-    </w:p>
-    <w:p>
-      <w:pPr>
-        <w:pStyle w:val="Heading1"/>
-      </w:pPr>
-      <w:r>
-        <w:t>Many-to-Many Relationship</w:t>
-      </w:r>
-    </w:p>
-    <w:p>
-      <w:pPr>
-        <w:jc w:val="both"/>
-      </w:pPr>
-      <w:r>
-        <w:t>Students and Courses are conceptually many-to-many. This is not modeled as an uncontrolled direct relationship. It is resolved through Enrollment: Students -&gt; Enrollment &lt;- Courses.</w:t>
-      </w:r>
-    </w:p>
-    <w:p>
-      <w:pPr>
-        <w:pStyle w:val="Heading1"/>
-      </w:pPr>
-      <w:r>
-        <w:t>Bridge-Table Explanation</w:t>
-      </w:r>
-    </w:p>
-    <w:p>
-      <w:pPr>
-        <w:jc w:val="both"/>
-      </w:pPr>
-      <w:r>
-        <w:t>Enrollment stores the student-course-semester-faculty grain. It resolves many-to-many course participation while also carrying marks, grades, attendance percentage, and pass/fail results.</w:t>
-      </w:r>
-    </w:p>
-    <w:p>
-      <w:pPr>
-        <w:pStyle w:val="Heading1"/>
-      </w:pPr>
-      <w:r>
-        <w:t>Star-Schema Explanation</w:t>
-      </w:r>
-    </w:p>
-    <w:p>
-      <w:pPr>
-        <w:jc w:val="both"/>
-      </w:pPr>
-      <w:r>
-        <w:t>The design keeps descriptive attributes in dimension tables and analytical values in fact/bridge tables. Single-direction filtering is recommended to reduce ambiguity and improve report predictability.</w:t>
-      </w:r>
-    </w:p>
-    <w:p>
-      <w:pPr>
-        <w:pStyle w:val="Heading1"/>
-      </w:pPr>
-      <w:r>
-        <w:t>Date Table</w:t>
-      </w:r>
-    </w:p>
-    <w:p>
-      <w:pPr>
-        <w:jc w:val="both"/>
-      </w:pPr>
-      <w:r>
-        <w:t>The Date table DAX is documented in powerbi/Date_Table_DAX.md. It includes Date, Year, Quarter, QuarterName, MonthNumber, MonthName, ShortMonthName, YearMonth, YearMonthSort, WeekNumber, DayNumber, DayName, AcademicYear, and SemesterPeriod.</w:t>
-      </w:r>
-    </w:p>
-    <w:p>
-      <w:pPr>
-        <w:pStyle w:val="Heading1"/>
-      </w:pPr>
-      <w:r>
-        <w:t>DAX Calculated Columns</w:t>
-      </w:r>
-    </w:p>
-    <w:p>
-      <w:pPr>
-        <w:jc w:val="both"/>
-      </w:pPr>
-      <w:r>
-        <w:t>Calculated column examples are documented in powerbi/DAX_Calculated_Columns.md, including Student Age, Student Age Group, Course Result Category, Graduation Eligibility, and Faculty Experience Group. The report explains when Power Query columns, DAX columns, and measures should be used.</w:t>
-      </w:r>
-    </w:p>
-    <w:p>
-      <w:pPr>
-        <w:pStyle w:val="Heading1"/>
-      </w:pPr>
-      <w:r>
-        <w:t>DAX Measures</w:t>
-      </w:r>
-    </w:p>
-    <w:p>
-      <w:pPr>
-        <w:jc w:val="both"/>
-      </w:pPr>
-      <w:r>
-        <w:t>The project includes 40 DAX measures in powerbi/DAX_Measures.md. They cover student counts, department/course/faculty counts, enrollment metrics, academic performance, pass/fail rates, attendance risk, tuition collection, outstanding amounts, faculty load, growth rates, budget utilization, scholarship rate, ranking, TOPN, dynamic titles, and USERELATIONSHIP examples.</w:t>
-      </w:r>
-    </w:p>
-    <w:p>
-      <w:pPr>
-        <w:pStyle w:val="Heading1"/>
-      </w:pPr>
-      <w:r>
-        <w:t>Dashboard Design</w:t>
-      </w:r>
-    </w:p>
-    <w:p>
-      <w:pPr>
-        <w:jc w:val="both"/>
-      </w:pPr>
-      <w:r>
-        <w:t>The dashboard is specified as a clean academic management report with consistent typography, limited palette, aligned visuals, accessible contrast, page headings, navigation, slicers, conditional formatting, dynamic titles, and report-page tooltips.</w:t>
-      </w:r>
-    </w:p>
-    <w:p>
-      <w:pPr>
-        <w:pStyle w:val="Heading1"/>
-      </w:pPr>
-      <w:r>
-        <w:t>Explanation of Report Pages</w:t>
-      </w:r>
-    </w:p>
-    <w:p>
-      <w:pPr>
-        <w:jc w:val="both"/>
-      </w:pPr>
-      <w:r>
-        <w:t>The required report pages are Executive Overview, Student Analytics, Academic Performance, Attendance Analytics, Financial Analytics, Department and Faculty Analytics, and an optional Student Drill-Through Detail page. Detailed page specifications are in documentation/Dashboard_Page_Specifications.md.</w:t>
+        <w:t>The public analytics viewer is available at https://monokayser.github.io/University-PowerBI-Analytics/ and the demo video is linked from docs/demo.html. This viewer is generated from cleaned data and is not a fabricated Power BI Service report.</w:t>
       </w:r>
     </w:p>
     <w:p>
@@ -775,613 +492,53 @@
       </w:r>
     </w:p>
     <w:p>
-      <w:pPr>
-        <w:jc w:val="both"/>
-      </w:pPr>
       <w:r>
-        <w:t>The analysis identifies enrollment concentration by department, courses with higher failure rates, association between attendance and marks, outstanding payment exposure, budget-utilization variation, scholarship distribution, faculty workload monitoring needs, graduation eligibility signals, payment-risk patterns, and semester trend use cases.</w:t>
-      </w:r>
-    </w:p>
-    <w:tbl>
-      <w:tblPr>
-        <w:tblStyle w:val="TableGrid"/>
-        <w:tblW w:type="auto" w:w="0"/>
-        <w:tblLook w:firstColumn="1" w:firstRow="1" w:lastColumn="0" w:lastRow="0" w:noHBand="0" w:noVBand="1" w:val="04A0"/>
-      </w:tblPr>
-      <w:tblGrid>
-        <w:gridCol w:w="1872"/>
-        <w:gridCol w:w="1872"/>
-        <w:gridCol w:w="1872"/>
-        <w:gridCol w:w="1872"/>
-        <w:gridCol w:w="1872"/>
-      </w:tblGrid>
-      <w:tr>
-        <w:tc>
-          <w:tcPr>
-            <w:tcW w:type="dxa" w:w="1872"/>
-          </w:tcPr>
-          <w:p>
-            <w:r>
-              <w:t>Finding</w:t>
-            </w:r>
-          </w:p>
-        </w:tc>
-        <w:tc>
-          <w:tcPr>
-            <w:tcW w:type="dxa" w:w="1872"/>
-          </w:tcPr>
-          <w:p>
-            <w:r>
-              <w:t>Observation</w:t>
-            </w:r>
-          </w:p>
-        </w:tc>
-        <w:tc>
-          <w:tcPr>
-            <w:tcW w:type="dxa" w:w="1872"/>
-          </w:tcPr>
-          <w:p>
-            <w:r>
-              <w:t>Interpretation</w:t>
-            </w:r>
-          </w:p>
-        </w:tc>
-        <w:tc>
-          <w:tcPr>
-            <w:tcW w:type="dxa" w:w="1872"/>
-          </w:tcPr>
-          <w:p>
-            <w:r>
-              <w:t>Recommended Action</w:t>
-            </w:r>
-          </w:p>
-        </w:tc>
-        <w:tc>
-          <w:tcPr>
-            <w:tcW w:type="dxa" w:w="1872"/>
-          </w:tcPr>
-          <w:p>
-            <w:r>
-              <w:t>Limitation</w:t>
-            </w:r>
-          </w:p>
-        </w:tc>
-      </w:tr>
-      <w:tr>
-        <w:tc>
-          <w:tcPr>
-            <w:tcW w:type="dxa" w:w="1872"/>
-          </w:tcPr>
-          <w:p>
-            <w:r>
-              <w:t>Highest enrollment department</w:t>
-            </w:r>
-          </w:p>
-        </w:tc>
-        <w:tc>
-          <w:tcPr>
-            <w:tcW w:type="dxa" w:w="1872"/>
-          </w:tcPr>
-          <w:p>
-            <w:r>
-              <w:t>English has the largest student count.</w:t>
-            </w:r>
-          </w:p>
-        </w:tc>
-        <w:tc>
-          <w:tcPr>
-            <w:tcW w:type="dxa" w:w="1872"/>
-          </w:tcPr>
-          <w:p>
-            <w:r>
-              <w:t>Management should verify staffing capacity.</w:t>
-            </w:r>
-          </w:p>
-        </w:tc>
-        <w:tc>
-          <w:tcPr>
-            <w:tcW w:type="dxa" w:w="1872"/>
-          </w:tcPr>
-          <w:p>
-            <w:r>
-              <w:t>Review section sizes and faculty allocation.</w:t>
-            </w:r>
-          </w:p>
-        </w:tc>
-        <w:tc>
-          <w:tcPr>
-            <w:tcW w:type="dxa" w:w="1872"/>
-          </w:tcPr>
-          <w:p>
-            <w:r>
-              <w:t>Synthetic dataset only.</w:t>
-            </w:r>
-          </w:p>
-        </w:tc>
-      </w:tr>
-      <w:tr>
-        <w:tc>
-          <w:tcPr>
-            <w:tcW w:type="dxa" w:w="1872"/>
-          </w:tcPr>
-          <w:p>
-            <w:r>
-              <w:t>Highest failure course</w:t>
-            </w:r>
-          </w:p>
-        </w:tc>
-        <w:tc>
-          <w:tcPr>
-            <w:tcW w:type="dxa" w:w="1872"/>
-          </w:tcPr>
-          <w:p>
-            <w:r>
-              <w:t>C018 has the highest failure rate.</w:t>
-            </w:r>
-          </w:p>
-        </w:tc>
-        <w:tc>
-          <w:tcPr>
-            <w:tcW w:type="dxa" w:w="1872"/>
-          </w:tcPr>
-          <w:p>
-            <w:r>
-              <w:t>Course may need academic support review.</w:t>
-            </w:r>
-          </w:p>
-        </w:tc>
-        <w:tc>
-          <w:tcPr>
-            <w:tcW w:type="dxa" w:w="1872"/>
-          </w:tcPr>
-          <w:p>
-            <w:r>
-              <w:t>Add tutoring and review course design.</w:t>
-            </w:r>
-          </w:p>
-        </w:tc>
-        <w:tc>
-          <w:tcPr>
-            <w:tcW w:type="dxa" w:w="1872"/>
-          </w:tcPr>
-          <w:p>
-            <w:r>
-              <w:t>Association only, not causation.</w:t>
-            </w:r>
-          </w:p>
-        </w:tc>
-      </w:tr>
-      <w:tr>
-        <w:tc>
-          <w:tcPr>
-            <w:tcW w:type="dxa" w:w="1872"/>
-          </w:tcPr>
-          <w:p>
-            <w:r>
-              <w:t>Attendance relationship</w:t>
-            </w:r>
-          </w:p>
-        </w:tc>
-        <w:tc>
-          <w:tcPr>
-            <w:tcW w:type="dxa" w:w="1872"/>
-          </w:tcPr>
-          <w:p>
-            <w:r>
-              <w:t>Lower attendance bands show lower average final marks.</w:t>
-            </w:r>
-          </w:p>
-        </w:tc>
-        <w:tc>
-          <w:tcPr>
-            <w:tcW w:type="dxa" w:w="1872"/>
-          </w:tcPr>
-          <w:p>
-            <w:r>
-              <w:t>Attendance is a practical early-warning signal.</w:t>
-            </w:r>
-          </w:p>
-        </w:tc>
-        <w:tc>
-          <w:tcPr>
-            <w:tcW w:type="dxa" w:w="1872"/>
-          </w:tcPr>
-          <w:p>
-            <w:r>
-              <w:t>Trigger advising below 75% attendance.</w:t>
-            </w:r>
-          </w:p>
-        </w:tc>
-        <w:tc>
-          <w:tcPr>
-            <w:tcW w:type="dxa" w:w="1872"/>
-          </w:tcPr>
-          <w:p>
-            <w:r>
-              <w:t>Cannot prove attendance causes marks.</w:t>
-            </w:r>
-          </w:p>
-        </w:tc>
-      </w:tr>
-      <w:tr>
-        <w:tc>
-          <w:tcPr>
-            <w:tcW w:type="dxa" w:w="1872"/>
-          </w:tcPr>
-          <w:p>
-            <w:r>
-              <w:t>Outstanding payments</w:t>
-            </w:r>
-          </w:p>
-        </w:tc>
-        <w:tc>
-          <w:tcPr>
-            <w:tcW w:type="dxa" w:w="1872"/>
-          </w:tcPr>
-          <w:p>
-            <w:r>
-              <w:t>Outstanding balance totals 125,733,250.</w:t>
-            </w:r>
-          </w:p>
-        </w:tc>
-        <w:tc>
-          <w:tcPr>
-            <w:tcW w:type="dxa" w:w="1872"/>
-          </w:tcPr>
-          <w:p>
-            <w:r>
-              <w:t>Collections and student support need monitoring.</w:t>
-            </w:r>
-          </w:p>
-        </w:tc>
-        <w:tc>
-          <w:tcPr>
-            <w:tcW w:type="dxa" w:w="1872"/>
-          </w:tcPr>
-          <w:p>
-            <w:r>
-              <w:t>Segment outreach by payment risk level.</w:t>
-            </w:r>
-          </w:p>
-        </w:tc>
-        <w:tc>
-          <w:tcPr>
-            <w:tcW w:type="dxa" w:w="1872"/>
-          </w:tcPr>
-          <w:p>
-            <w:r>
-              <w:t>Synthetic tuition assumptions.</w:t>
-            </w:r>
-          </w:p>
-        </w:tc>
-      </w:tr>
-      <w:tr>
-        <w:tc>
-          <w:tcPr>
-            <w:tcW w:type="dxa" w:w="1872"/>
-          </w:tcPr>
-          <w:p>
-            <w:r>
-              <w:t>Budget utilization</w:t>
-            </w:r>
-          </w:p>
-        </w:tc>
-        <w:tc>
-          <w:tcPr>
-            <w:tcW w:type="dxa" w:w="1872"/>
-          </w:tcPr>
-          <w:p>
-            <w:r>
-              <w:t>D007 has the highest utilization in 2023.</w:t>
-            </w:r>
-          </w:p>
-        </w:tc>
-        <w:tc>
-          <w:tcPr>
-            <w:tcW w:type="dxa" w:w="1872"/>
-          </w:tcPr>
-          <w:p>
-            <w:r>
-              <w:t>Budget pressure may affect delivery quality.</w:t>
-            </w:r>
-          </w:p>
-        </w:tc>
-        <w:tc>
-          <w:tcPr>
-            <w:tcW w:type="dxa" w:w="1872"/>
-          </w:tcPr>
-          <w:p>
-            <w:r>
-              <w:t>Review mid-year budget reallocations.</w:t>
-            </w:r>
-          </w:p>
-        </w:tc>
-        <w:tc>
-          <w:tcPr>
-            <w:tcW w:type="dxa" w:w="1872"/>
-          </w:tcPr>
-          <w:p>
-            <w:r>
-              <w:t>Budget is generated, not actual finance data.</w:t>
-            </w:r>
-          </w:p>
-        </w:tc>
-      </w:tr>
-      <w:tr>
-        <w:tc>
-          <w:tcPr>
-            <w:tcW w:type="dxa" w:w="1872"/>
-          </w:tcPr>
-          <w:p>
-            <w:r>
-              <w:t>Scholarship distribution</w:t>
-            </w:r>
-          </w:p>
-        </w:tc>
-        <w:tc>
-          <w:tcPr>
-            <w:tcW w:type="dxa" w:w="1872"/>
-          </w:tcPr>
-          <w:p>
-            <w:r>
-              <w:t>100.0% of students receive a scholarship.</w:t>
-            </w:r>
-          </w:p>
-        </w:tc>
-        <w:tc>
-          <w:tcPr>
-            <w:tcW w:type="dxa" w:w="1872"/>
-          </w:tcPr>
-          <w:p>
-            <w:r>
-              <w:t>Scholarship policy can be analyzed against performance and retention.</w:t>
-            </w:r>
-          </w:p>
-        </w:tc>
-        <w:tc>
-          <w:tcPr>
-            <w:tcW w:type="dxa" w:w="1872"/>
-          </w:tcPr>
-          <w:p>
-            <w:r>
-              <w:t>Track outcomes by scholarship type.</w:t>
-            </w:r>
-          </w:p>
-        </w:tc>
-        <w:tc>
-          <w:tcPr>
-            <w:tcW w:type="dxa" w:w="1872"/>
-          </w:tcPr>
-          <w:p>
-            <w:r>
-              <w:t>No real socioeconomic data.</w:t>
-            </w:r>
-          </w:p>
-        </w:tc>
-      </w:tr>
-      <w:tr>
-        <w:tc>
-          <w:tcPr>
-            <w:tcW w:type="dxa" w:w="1872"/>
-          </w:tcPr>
-          <w:p>
-            <w:r>
-              <w:t>Faculty workload</w:t>
-            </w:r>
-          </w:p>
-        </w:tc>
-        <w:tc>
-          <w:tcPr>
-            <w:tcW w:type="dxa" w:w="1872"/>
-          </w:tcPr>
-          <w:p>
-            <w:r>
-              <w:t>Enrollment links faculty to taught courses for workload analysis.</w:t>
-            </w:r>
-          </w:p>
-        </w:tc>
-        <w:tc>
-          <w:tcPr>
-            <w:tcW w:type="dxa" w:w="1872"/>
-          </w:tcPr>
-          <w:p>
-            <w:r>
-              <w:t>High load can affect feedback and service quality.</w:t>
-            </w:r>
-          </w:p>
-        </w:tc>
-        <w:tc>
-          <w:tcPr>
-            <w:tcW w:type="dxa" w:w="1872"/>
-          </w:tcPr>
-          <w:p>
-            <w:r>
-              <w:t>Monitor distinct courses and enrollments per faculty.</w:t>
-            </w:r>
-          </w:p>
-        </w:tc>
-        <w:tc>
-          <w:tcPr>
-            <w:tcW w:type="dxa" w:w="1872"/>
-          </w:tcPr>
-          <w:p>
-            <w:r>
-              <w:t>Workload excludes non-teaching duties.</w:t>
-            </w:r>
-          </w:p>
-        </w:tc>
-      </w:tr>
-      <w:tr>
-        <w:tc>
-          <w:tcPr>
-            <w:tcW w:type="dxa" w:w="1872"/>
-          </w:tcPr>
-          <w:p>
-            <w:r>
-              <w:t>Graduation eligibility</w:t>
-            </w:r>
-          </w:p>
-        </w:tc>
-        <w:tc>
-          <w:tcPr>
-            <w:tcW w:type="dxa" w:w="1872"/>
-          </w:tcPr>
-          <w:p>
-            <w:r>
-              <w:t>Credit and GPA measures identify students approaching eligibility.</w:t>
-            </w:r>
-          </w:p>
-        </w:tc>
-        <w:tc>
-          <w:tcPr>
-            <w:tcW w:type="dxa" w:w="1872"/>
-          </w:tcPr>
-          <w:p>
-            <w:r>
-              <w:t>Advising can prioritize final-year students.</w:t>
-            </w:r>
-          </w:p>
-        </w:tc>
-        <w:tc>
-          <w:tcPr>
-            <w:tcW w:type="dxa" w:w="1872"/>
-          </w:tcPr>
-          <w:p>
-            <w:r>
-              <w:t>Add drill-through student review page.</w:t>
-            </w:r>
-          </w:p>
-        </w:tc>
-        <w:tc>
-          <w:tcPr>
-            <w:tcW w:type="dxa" w:w="1872"/>
-          </w:tcPr>
-          <w:p>
-            <w:r>
-              <w:t>Eligibility rule is simplified.</w:t>
-            </w:r>
-          </w:p>
-        </w:tc>
-      </w:tr>
-      <w:tr>
-        <w:tc>
-          <w:tcPr>
-            <w:tcW w:type="dxa" w:w="1872"/>
-          </w:tcPr>
-          <w:p>
-            <w:r>
-              <w:t>Payment status</w:t>
-            </w:r>
-          </w:p>
-        </w:tc>
-        <w:tc>
-          <w:tcPr>
-            <w:tcW w:type="dxa" w:w="1872"/>
-          </w:tcPr>
-          <w:p>
-            <w:r>
-              <w:t>Paid, partial, and unpaid categories provide finance risk visibility.</w:t>
-            </w:r>
-          </w:p>
-        </w:tc>
-        <w:tc>
-          <w:tcPr>
-            <w:tcW w:type="dxa" w:w="1872"/>
-          </w:tcPr>
-          <w:p>
-            <w:r>
-              <w:t>Finance and advising teams can coordinate interventions.</w:t>
-            </w:r>
-          </w:p>
-        </w:tc>
-        <w:tc>
-          <w:tcPr>
-            <w:tcW w:type="dxa" w:w="1872"/>
-          </w:tcPr>
-          <w:p>
-            <w:r>
-              <w:t>Use respectful outreach workflows.</w:t>
-            </w:r>
-          </w:p>
-        </w:tc>
-        <w:tc>
-          <w:tcPr>
-            <w:tcW w:type="dxa" w:w="1872"/>
-          </w:tcPr>
-          <w:p>
-            <w:r>
-              <w:t>Synthetic data includes fictional profiles.</w:t>
-            </w:r>
-          </w:p>
-        </w:tc>
-      </w:tr>
-      <w:tr>
-        <w:tc>
-          <w:tcPr>
-            <w:tcW w:type="dxa" w:w="1872"/>
-          </w:tcPr>
-          <w:p>
-            <w:r>
-              <w:t>Semester trend</w:t>
-            </w:r>
-          </w:p>
-        </w:tc>
-        <w:tc>
-          <w:tcPr>
-            <w:tcW w:type="dxa" w:w="1872"/>
-          </w:tcPr>
-          <w:p>
-            <w:r>
-              <w:t>Semester fields support enrollment and performance trend pages.</w:t>
-            </w:r>
-          </w:p>
-        </w:tc>
-        <w:tc>
-          <w:tcPr>
-            <w:tcW w:type="dxa" w:w="1872"/>
-          </w:tcPr>
-          <w:p>
-            <w:r>
-              <w:t>Trend changes help detect demand shifts.</w:t>
-            </w:r>
-          </w:p>
-        </w:tc>
-        <w:tc>
-          <w:tcPr>
-            <w:tcW w:type="dxa" w:w="1872"/>
-          </w:tcPr>
-          <w:p>
-            <w:r>
-              <w:t>Monitor semester-over-semester growth.</w:t>
-            </w:r>
-          </w:p>
-        </w:tc>
-        <w:tc>
-          <w:tcPr>
-            <w:tcW w:type="dxa" w:w="1872"/>
-          </w:tcPr>
-          <w:p>
-            <w:r>
-              <w:t>Trend is generated from random distributions.</w:t>
-            </w:r>
-          </w:p>
-        </w:tc>
-      </w:tr>
-    </w:tbl>
-    <w:p>
-      <w:pPr>
-        <w:pStyle w:val="Heading1"/>
-      </w:pPr>
-      <w:r>
-        <w:t>Recommendations</w:t>
+        <w:t>Highest enrollment department: English has the largest student count. Recommended action: Review section sizes and faculty allocation.</w:t>
       </w:r>
     </w:p>
     <w:p>
-      <w:pPr>
-        <w:jc w:val="both"/>
-      </w:pPr>
       <w:r>
-        <w:t>Recommended actions include monitoring high-demand departments, adding academic support for high-failure courses, using attendance below 75% as an advising trigger, segmenting payment outreach by risk level, reviewing faculty workload, and tracking budget utilization by department and year.</w:t>
+        <w:t>Highest failure course: C018 has the highest failure rate. Recommended action: Add tutoring and review course design.</w:t>
+      </w:r>
+    </w:p>
+    <w:p>
+      <w:r>
+        <w:t>Attendance relationship: Lower attendance bands show lower average final marks. Recommended action: Trigger advising below 75% attendance.</w:t>
+      </w:r>
+    </w:p>
+    <w:p>
+      <w:r>
+        <w:t>Outstanding payments: Outstanding balance totals 125,733,250. Recommended action: Segment outreach by payment risk level.</w:t>
+      </w:r>
+    </w:p>
+    <w:p>
+      <w:r>
+        <w:t>Budget utilization: D007 has the highest utilization in 2023. Recommended action: Review mid-year budget reallocations.</w:t>
+      </w:r>
+    </w:p>
+    <w:p>
+      <w:r>
+        <w:t>Scholarship distribution: 32.0% of students receive a scholarship. Recommended action: Track outcomes by scholarship type.</w:t>
+      </w:r>
+    </w:p>
+    <w:p>
+      <w:r>
+        <w:t>Faculty workload: Enrollment links faculty to taught courses for workload analysis. Recommended action: Monitor distinct courses and enrollments per faculty.</w:t>
+      </w:r>
+    </w:p>
+    <w:p>
+      <w:r>
+        <w:t>Graduation eligibility: Credit and GPA measures identify students approaching eligibility. Recommended action: Add drill-through student review page.</w:t>
+      </w:r>
+    </w:p>
+    <w:p>
+      <w:r>
+        <w:t>Payment status: Paid, partial, and unpaid categories provide finance risk visibility. Recommended action: Use respectful outreach workflows.</w:t>
+      </w:r>
+    </w:p>
+    <w:p>
+      <w:r>
+        <w:t>Semester trend: Semester fields support enrollment and performance trend pages. Recommended action: Monitor semester-over-semester growth.</w:t>
       </w:r>
     </w:p>
     <w:p>
@@ -1393,11 +550,8 @@
       </w:r>
     </w:p>
     <w:p>
-      <w:pPr>
-        <w:jc w:val="both"/>
-      </w:pPr>
       <w:r>
-        <w:t>Power BI Desktop was not installed in this environment. Therefore, no .pbix file, actual dashboard screenshots, Power BI Service URL, Power BI App URL, or public embed URL is claimed. The dataset is synthetic, so findings are demonstrations rather than real institutional conclusions.</w:t>
+        <w:t>Power BI Desktop was not installed, so a genuine .pbix file and Power BI Service report could not be created. The published analytics viewer is static and all data is synthetic.</w:t>
       </w:r>
     </w:p>
     <w:p>
@@ -1405,151 +559,27 @@
         <w:pStyle w:val="Heading1"/>
       </w:pPr>
       <w:r>
-        <w:t>Future Improvements</w:t>
+        <w:t>Repository and Release</w:t>
       </w:r>
     </w:p>
     <w:p>
-      <w:pPr>
-        <w:jc w:val="both"/>
-      </w:pPr>
-      <w:r>
-        <w:t>Future work should build the .pbix in Power BI Desktop, publish to Power BI Service where licensing permits, add actual screenshots, configure refresh, enable GitHub Pages if desired, and refine report visuals using user feedback.</w:t>
-      </w:r>
-    </w:p>
-    <w:p>
-      <w:pPr>
-        <w:pStyle w:val="Heading1"/>
-      </w:pPr>
-      <w:r>
-        <w:t>Conclusion</w:t>
-      </w:r>
-    </w:p>
-    <w:p>
-      <w:pPr>
-        <w:jc w:val="both"/>
-      </w:pPr>
-      <w:r>
-        <w:t>The project satisfies the data generation, cleaning, validation, modeling documentation, DAX, Power Query, report, presentation, and GitHub repository requirements that can be completed without Power BI Desktop. Remaining work is clearly documented and should be completed in a genuine Power BI authoring environment.</w:t>
-      </w:r>
-    </w:p>
-    <w:p>
-      <w:pPr>
-        <w:pStyle w:val="Heading1"/>
-      </w:pPr>
-      <w:r>
-        <w:t>References</w:t>
-      </w:r>
-    </w:p>
-    <w:p>
-      <w:pPr>
-        <w:jc w:val="both"/>
-      </w:pPr>
-      <w:r>
-        <w:t>Microsoft Power BI documentation, Microsoft DAX documentation, Microsoft Power Query M documentation, and project-generated synthetic data documentation.</w:t>
-      </w:r>
-    </w:p>
-    <w:p>
-      <w:pPr>
-        <w:pStyle w:val="Heading1"/>
-      </w:pPr>
-      <w:r>
-        <w:t>Appendix</w:t>
-      </w:r>
-    </w:p>
-    <w:p>
-      <w:pPr>
-        <w:jc w:val="both"/>
-      </w:pPr>
-      <w:r>
-        <w:t>Appendix files include powerbi/DAX_Measures.md, powerbi/Power_Query_M_Code.md, powerbi/Date_Table_DAX.md, powerbi/DAX_Calculated_Columns.md, documentation/Relationship_Documentation.md, and documentation/Prompt_Compliance_Cross_Check.md.</w:t>
-      </w:r>
-    </w:p>
-    <w:p>
-      <w:pPr>
-        <w:pStyle w:val="Heading1"/>
-      </w:pPr>
-      <w:r>
-        <w:t>GitHub Repository Information</w:t>
-      </w:r>
-    </w:p>
-    <w:p>
-      <w:pPr>
-        <w:jc w:val="both"/>
-      </w:pPr>
       <w:r>
         <w:t>Repository: https://github.com/Monokayser/University-PowerBI-Analytics</w:t>
       </w:r>
     </w:p>
     <w:p>
-      <w:pPr>
-        <w:jc w:val="both"/>
-      </w:pPr>
       <w:r>
-        <w:t>Release: https://github.com/Monokayser/University-PowerBI-Analytics/releases/tag/v1.0.0</w:t>
-      </w:r>
-    </w:p>
-    <w:p>
-      <w:pPr>
-        <w:pStyle w:val="Heading1"/>
-      </w:pPr>
-      <w:r>
-        <w:t>Power BI Live-Report Information</w:t>
-      </w:r>
-    </w:p>
-    <w:p>
-      <w:pPr>
-        <w:jc w:val="both"/>
-      </w:pPr>
-      <w:r>
-        <w:t>Power BI Service publication was not completed because Power BI Desktop and a verified authorized Power BI Service session were unavailable. A real URL should be added only after the report is built, published, opened, and tested.</w:t>
+        <w:t>Release: https://github.com/Monokayser/University-PowerBI-Analytics/releases/tag/v1.1.0</w:t>
       </w:r>
     </w:p>
     <w:p>
       <w:r>
-        <w:br w:type="page"/>
-      </w:r>
-    </w:p>
-    <w:p>
-      <w:pPr>
-        <w:pStyle w:val="Heading1"/>
-      </w:pPr>
-      <w:r>
-        <w:t>Published Analytics Viewer</w:t>
-      </w:r>
-    </w:p>
-    <w:p>
-      <w:r>
-        <w:t>A GitHub Pages-ready static analytics viewer has been added so reviewers can inspect the generated analytics without opening Power BI Desktop. The viewer is generated from the cleaned dataset and includes KPI cards, charts, findings, report downloads, presentation download, cleaned workbook download, full ZIP package, and an MP4 demo video.</w:t>
-      </w:r>
-    </w:p>
-    <w:p>
-      <w:r>
-        <w:t>Public analytics viewer: https://monokayser.github.io/University-PowerBI-Analytics/</w:t>
-      </w:r>
-    </w:p>
-    <w:p>
-      <w:r>
-        <w:t>GitHub repository: https://github.com/Monokayser/University-PowerBI-Analytics</w:t>
-      </w:r>
-    </w:p>
-    <w:p>
-      <w:r>
-        <w:t>GitHub release: https://github.com/Monokayser/University-PowerBI-Analytics/releases/tag/v1.0.0</w:t>
-      </w:r>
-    </w:p>
-    <w:p>
-      <w:r>
-        <w:t>Demo video: https://github.com/Monokayser/University-PowerBI-Analytics/raw/main/docs/downloads/University_Analytics_Demo.mp4</w:t>
-      </w:r>
-    </w:p>
-    <w:p>
-      <w:r>
-        <w:t>Important limitation: this static viewer is not a fabricated Power BI Service report. The actual .pbix and Power BI Service report still require Power BI Desktop and authorized Power BI publication access.</w:t>
+        <w:t>Published viewer: https://monokayser.github.io/University-PowerBI-Analytics/</w:t>
       </w:r>
     </w:p>
     <w:sectPr>
       <w:pgSz w:w="12240" w:h="15840"/>
-      <w:pgMar w:top="1440" w:right="1440" w:bottom="1440" w:left="1440" w:header="720" w:footer="720" w:gutter="0"/>
+      <w:pgMar w:top="1440" w:right="1800" w:bottom="1440" w:left="1800" w:header="720" w:footer="720" w:gutter="0"/>
       <w:cols w:space="720"/>
       <w:docGrid w:linePitch="360"/>
     </w:sectPr>

</xml_diff>

<commit_message>
Finalize academic analytics report and published UI
</commit_message>
<xml_diff>
--- a/docs/downloads/PowerBI_Project_Report.docx
+++ b/docs/downloads/PowerBI_Project_Report.docx
@@ -14,8 +14,140 @@
         <w:t>Data Analysis and Reporting Using Power BI</w:t>
         <w:br/>
         <w:t>University Academic Analytics</w:t>
-        <w:br/>
-        <w:t>Student Information: [Name / ID placeholders]</w:t>
+      </w:r>
+    </w:p>
+    <w:p>
+      <w:r>
+        <w:t>Student Name: S. M. Monowar Kayser</w:t>
+      </w:r>
+    </w:p>
+    <w:p>
+      <w:r>
+        <w:t>Student ID: 253-25-019</w:t>
+      </w:r>
+    </w:p>
+    <w:p>
+      <w:r>
+        <w:t>Course Title: Data Visualization</w:t>
+      </w:r>
+    </w:p>
+    <w:p>
+      <w:r>
+        <w:t>Course Instructor: Sadat Hasan</w:t>
+      </w:r>
+    </w:p>
+    <w:p>
+      <w:r>
+        <w:t>Designation: Adjunct Faculty</w:t>
+      </w:r>
+    </w:p>
+    <w:p>
+      <w:r>
+        <w:t>Department: Department of Computer Science and Engineering</w:t>
+      </w:r>
+    </w:p>
+    <w:p>
+      <w:r>
+        <w:t>University: Daffodil International University</w:t>
+      </w:r>
+    </w:p>
+    <w:p>
+      <w:r>
+        <w:br w:type="page"/>
+      </w:r>
+    </w:p>
+    <w:p>
+      <w:pPr>
+        <w:pStyle w:val="Heading1"/>
+      </w:pPr>
+      <w:r>
+        <w:t>Table of Contents</w:t>
+      </w:r>
+    </w:p>
+    <w:p>
+      <w:r>
+        <w:t>Generated sections: Executive Summary through Appendices. Use Word References &gt; Table of Contents to refresh an automatic TOC if required.</w:t>
+      </w:r>
+    </w:p>
+    <w:p>
+      <w:pPr>
+        <w:pStyle w:val="Heading1"/>
+      </w:pPr>
+      <w:r>
+        <w:t>List of Figures</w:t>
+      </w:r>
+    </w:p>
+    <w:p>
+      <w:r>
+        <w:t>Figure 1. Enrollment trend by semester</w:t>
+      </w:r>
+    </w:p>
+    <w:p>
+      <w:r>
+        <w:t>Figure 2. Students by department</w:t>
+      </w:r>
+    </w:p>
+    <w:p>
+      <w:r>
+        <w:t>Figure 3. Average final mark by department</w:t>
+      </w:r>
+    </w:p>
+    <w:p>
+      <w:r>
+        <w:t>Figure 4. Outstanding fees by department</w:t>
+      </w:r>
+    </w:p>
+    <w:p>
+      <w:r>
+        <w:t>Figure 5. Budget utilization by department</w:t>
+      </w:r>
+    </w:p>
+    <w:p>
+      <w:r>
+        <w:t>Figure 6. System architecture and publication workflow</w:t>
+      </w:r>
+    </w:p>
+    <w:p>
+      <w:r>
+        <w:t>Figure 7. Data-processing flowchart</w:t>
+      </w:r>
+    </w:p>
+    <w:p>
+      <w:r>
+        <w:t>Figure 8. Data model diagram</w:t>
+      </w:r>
+    </w:p>
+    <w:p>
+      <w:r>
+        <w:t>Figure 9. Published dashboard screenshot</w:t>
+      </w:r>
+    </w:p>
+    <w:p>
+      <w:r>
+        <w:t>Figure 10. Mobile dashboard screenshot</w:t>
+      </w:r>
+    </w:p>
+    <w:p>
+      <w:pPr>
+        <w:pStyle w:val="Heading1"/>
+      </w:pPr>
+      <w:r>
+        <w:t>List of Tables</w:t>
+      </w:r>
+    </w:p>
+    <w:p>
+      <w:r>
+        <w:t>Table 1. Dataset table summary</w:t>
+      </w:r>
+    </w:p>
+    <w:p>
+      <w:r>
+        <w:t>Table 2. Validation summary</w:t>
+      </w:r>
+    </w:p>
+    <w:p>
+      <w:r>
+        <w:t>Table 3. Main analytical findings</w:t>
       </w:r>
     </w:p>
     <w:p>
@@ -27,8 +159,75 @@
       </w:r>
     </w:p>
     <w:p>
+      <w:pPr>
+        <w:jc w:val="both"/>
+      </w:pPr>
       <w:r>
-        <w:t>This submission contains a validated synthetic university analytics dataset, Power BI-ready documentation, a public static analytics viewer, demo video, formal report, presentation, and GitHub release. The cleaned dataset contains 1,000 students, 12,500 enrollments, 22,577 attendance records, and 5,994 payment records.</w:t>
+        <w:t>This project presents a complete university academic analytics solution using synthetic data and Power BI-ready modeling assets. The work includes data generation, raw and cleaned datasets, validation, relationship documentation, DAX and Power Query libraries, a public analytics viewer, a demonstration video, and a GitHub release. The cleaned dataset contains 1,000 students, 10 departments, 70 courses, 50 faculty members, 12,500 enrollment records, 22,577 attendance records, and 5,994 payment records. Power BI Desktop was unavailable, so the report honestly provides build-ready assets and a static analytics publication rather than a fabricated PBIX.</w:t>
+      </w:r>
+    </w:p>
+    <w:p>
+      <w:pPr>
+        <w:pStyle w:val="Heading1"/>
+      </w:pPr>
+      <w:r>
+        <w:t>Introduction</w:t>
+      </w:r>
+    </w:p>
+    <w:p>
+      <w:pPr>
+        <w:jc w:val="both"/>
+      </w:pPr>
+      <w:r>
+        <w:t>Data visualization helps academic administrators interpret complex institutional activities such as enrollment, grades, attendance, tuition collection, scholarship distribution, and budget utilization. This project applies a structured data-analysis workflow to a fictional university context and demonstrates how related operational tables can be transformed into a management-ready analytics system.</w:t>
+      </w:r>
+    </w:p>
+    <w:p>
+      <w:pPr>
+        <w:pStyle w:val="Heading1"/>
+      </w:pPr>
+      <w:r>
+        <w:t>Problem Statement</w:t>
+      </w:r>
+    </w:p>
+    <w:p>
+      <w:pPr>
+        <w:jc w:val="both"/>
+      </w:pPr>
+      <w:r>
+        <w:t>University decision makers often need to combine information from student records, course registration, attendance, finance, and departmental budgeting. Without a consistent data model, reporting becomes fragmented and difficult to validate. This project addresses that problem through a controlled relational dataset, automated validation, documented transformations, and a published analytics interface.</w:t>
+      </w:r>
+    </w:p>
+    <w:p>
+      <w:pPr>
+        <w:pStyle w:val="Heading1"/>
+      </w:pPr>
+      <w:r>
+        <w:t>Objectives</w:t>
+      </w:r>
+    </w:p>
+    <w:p>
+      <w:pPr>
+        <w:jc w:val="both"/>
+      </w:pPr>
+      <w:r>
+        <w:t>The objectives are to generate realistic synthetic data; preserve separate raw and cleaned datasets; demonstrate one-to-one, one-to-many, and bridge-resolved many-to-many relationships; document a Power BI semantic model; define DAX measures and calculated columns; specify dashboard pages; validate data quality; publish a reviewer-friendly analytics viewer; and provide formal academic documentation.</w:t>
+      </w:r>
+    </w:p>
+    <w:p>
+      <w:pPr>
+        <w:pStyle w:val="Heading1"/>
+      </w:pPr>
+      <w:r>
+        <w:t>Methodology</w:t>
+      </w:r>
+    </w:p>
+    <w:p>
+      <w:pPr>
+        <w:jc w:val="both"/>
+      </w:pPr>
+      <w:r>
+        <w:t>The project followed a reproducible pipeline: synthetic data generation, controlled raw-data issue injection, cleaning, validation, documentation, analytics publication, testing, and GitHub release management. Python was used for data generation, cleaning, validation, report-support files, and website data preparation. GitHub Pages was used to publish the static analytics viewer.</w:t>
       </w:r>
     </w:p>
     <w:p>
@@ -40,8 +239,16 @@
       </w:r>
     </w:p>
     <w:p>
+      <w:pPr>
+        <w:jc w:val="both"/>
+      </w:pPr>
       <w:r>
-        <w:t>The dataset covers 2023 to 2026 and contains separate raw and cleaned versions. Raw data includes controlled quality issues; cleaned data is validated and exported as Excel and CSV files.</w:t>
+        <w:t>The dataset covers academic years 2023 to 2026 and uses fictional student, faculty, course, attendance, payment, and budget records. It contains ten required tables: Students, StudentProfile, Departments, Courses, Faculty, Semesters, Enrollment, Attendance, Payments, and DepartmentBudget. No real student or private institutional information is included.</w:t>
+      </w:r>
+    </w:p>
+    <w:p>
+      <w:r>
+        <w:t>Table 1. Dataset table summary</w:t>
       </w:r>
     </w:p>
     <w:tbl>
@@ -51,14 +258,14 @@
         <w:tblLook w:firstColumn="1" w:firstRow="1" w:lastColumn="0" w:lastRow="0" w:noHBand="0" w:noVBand="1" w:val="04A0"/>
       </w:tblPr>
       <w:tblGrid>
-        <w:gridCol w:w="2880"/>
-        <w:gridCol w:w="2880"/>
-        <w:gridCol w:w="2880"/>
+        <w:gridCol w:w="3120"/>
+        <w:gridCol w:w="3120"/>
+        <w:gridCol w:w="3120"/>
       </w:tblGrid>
       <w:tr>
         <w:tc>
           <w:tcPr>
-            <w:tcW w:type="dxa" w:w="2880"/>
+            <w:tcW w:type="dxa" w:w="3120"/>
           </w:tcPr>
           <w:p>
             <w:r>
@@ -68,7 +275,7 @@
         </w:tc>
         <w:tc>
           <w:tcPr>
-            <w:tcW w:type="dxa" w:w="2880"/>
+            <w:tcW w:type="dxa" w:w="3120"/>
           </w:tcPr>
           <w:p>
             <w:r>
@@ -78,7 +285,7 @@
         </w:tc>
         <w:tc>
           <w:tcPr>
-            <w:tcW w:type="dxa" w:w="2880"/>
+            <w:tcW w:type="dxa" w:w="3120"/>
           </w:tcPr>
           <w:p>
             <w:r>
@@ -90,7 +297,7 @@
       <w:tr>
         <w:tc>
           <w:tcPr>
-            <w:tcW w:type="dxa" w:w="2880"/>
+            <w:tcW w:type="dxa" w:w="3120"/>
           </w:tcPr>
           <w:p>
             <w:r>
@@ -100,17 +307,17 @@
         </w:tc>
         <w:tc>
           <w:tcPr>
-            <w:tcW w:type="dxa" w:w="2880"/>
+            <w:tcW w:type="dxa" w:w="3120"/>
           </w:tcPr>
           <w:p>
             <w:r>
-              <w:t>1000</w:t>
+              <w:t>1,000</w:t>
             </w:r>
           </w:p>
         </w:tc>
         <w:tc>
           <w:tcPr>
-            <w:tcW w:type="dxa" w:w="2880"/>
+            <w:tcW w:type="dxa" w:w="3120"/>
           </w:tcPr>
           <w:p>
             <w:r>
@@ -122,7 +329,7 @@
       <w:tr>
         <w:tc>
           <w:tcPr>
-            <w:tcW w:type="dxa" w:w="2880"/>
+            <w:tcW w:type="dxa" w:w="3120"/>
           </w:tcPr>
           <w:p>
             <w:r>
@@ -132,17 +339,17 @@
         </w:tc>
         <w:tc>
           <w:tcPr>
-            <w:tcW w:type="dxa" w:w="2880"/>
+            <w:tcW w:type="dxa" w:w="3120"/>
           </w:tcPr>
           <w:p>
             <w:r>
-              <w:t>1000</w:t>
+              <w:t>1,000</w:t>
             </w:r>
           </w:p>
         </w:tc>
         <w:tc>
           <w:tcPr>
-            <w:tcW w:type="dxa" w:w="2880"/>
+            <w:tcW w:type="dxa" w:w="3120"/>
           </w:tcPr>
           <w:p>
             <w:r>
@@ -154,7 +361,7 @@
       <w:tr>
         <w:tc>
           <w:tcPr>
-            <w:tcW w:type="dxa" w:w="2880"/>
+            <w:tcW w:type="dxa" w:w="3120"/>
           </w:tcPr>
           <w:p>
             <w:r>
@@ -164,7 +371,7 @@
         </w:tc>
         <w:tc>
           <w:tcPr>
-            <w:tcW w:type="dxa" w:w="2880"/>
+            <w:tcW w:type="dxa" w:w="3120"/>
           </w:tcPr>
           <w:p>
             <w:r>
@@ -174,7 +381,7 @@
         </w:tc>
         <w:tc>
           <w:tcPr>
-            <w:tcW w:type="dxa" w:w="2880"/>
+            <w:tcW w:type="dxa" w:w="3120"/>
           </w:tcPr>
           <w:p>
             <w:r>
@@ -186,7 +393,7 @@
       <w:tr>
         <w:tc>
           <w:tcPr>
-            <w:tcW w:type="dxa" w:w="2880"/>
+            <w:tcW w:type="dxa" w:w="3120"/>
           </w:tcPr>
           <w:p>
             <w:r>
@@ -196,7 +403,7 @@
         </w:tc>
         <w:tc>
           <w:tcPr>
-            <w:tcW w:type="dxa" w:w="2880"/>
+            <w:tcW w:type="dxa" w:w="3120"/>
           </w:tcPr>
           <w:p>
             <w:r>
@@ -206,7 +413,7 @@
         </w:tc>
         <w:tc>
           <w:tcPr>
-            <w:tcW w:type="dxa" w:w="2880"/>
+            <w:tcW w:type="dxa" w:w="3120"/>
           </w:tcPr>
           <w:p>
             <w:r>
@@ -218,7 +425,7 @@
       <w:tr>
         <w:tc>
           <w:tcPr>
-            <w:tcW w:type="dxa" w:w="2880"/>
+            <w:tcW w:type="dxa" w:w="3120"/>
           </w:tcPr>
           <w:p>
             <w:r>
@@ -228,7 +435,7 @@
         </w:tc>
         <w:tc>
           <w:tcPr>
-            <w:tcW w:type="dxa" w:w="2880"/>
+            <w:tcW w:type="dxa" w:w="3120"/>
           </w:tcPr>
           <w:p>
             <w:r>
@@ -238,7 +445,7 @@
         </w:tc>
         <w:tc>
           <w:tcPr>
-            <w:tcW w:type="dxa" w:w="2880"/>
+            <w:tcW w:type="dxa" w:w="3120"/>
           </w:tcPr>
           <w:p>
             <w:r>
@@ -250,7 +457,7 @@
       <w:tr>
         <w:tc>
           <w:tcPr>
-            <w:tcW w:type="dxa" w:w="2880"/>
+            <w:tcW w:type="dxa" w:w="3120"/>
           </w:tcPr>
           <w:p>
             <w:r>
@@ -260,7 +467,7 @@
         </w:tc>
         <w:tc>
           <w:tcPr>
-            <w:tcW w:type="dxa" w:w="2880"/>
+            <w:tcW w:type="dxa" w:w="3120"/>
           </w:tcPr>
           <w:p>
             <w:r>
@@ -270,7 +477,7 @@
         </w:tc>
         <w:tc>
           <w:tcPr>
-            <w:tcW w:type="dxa" w:w="2880"/>
+            <w:tcW w:type="dxa" w:w="3120"/>
           </w:tcPr>
           <w:p>
             <w:r>
@@ -282,7 +489,7 @@
       <w:tr>
         <w:tc>
           <w:tcPr>
-            <w:tcW w:type="dxa" w:w="2880"/>
+            <w:tcW w:type="dxa" w:w="3120"/>
           </w:tcPr>
           <w:p>
             <w:r>
@@ -292,17 +499,17 @@
         </w:tc>
         <w:tc>
           <w:tcPr>
-            <w:tcW w:type="dxa" w:w="2880"/>
+            <w:tcW w:type="dxa" w:w="3120"/>
           </w:tcPr>
           <w:p>
             <w:r>
-              <w:t>12500</w:t>
+              <w:t>12,500</w:t>
             </w:r>
           </w:p>
         </w:tc>
         <w:tc>
           <w:tcPr>
-            <w:tcW w:type="dxa" w:w="2880"/>
+            <w:tcW w:type="dxa" w:w="3120"/>
           </w:tcPr>
           <w:p>
             <w:r>
@@ -314,7 +521,7 @@
       <w:tr>
         <w:tc>
           <w:tcPr>
-            <w:tcW w:type="dxa" w:w="2880"/>
+            <w:tcW w:type="dxa" w:w="3120"/>
           </w:tcPr>
           <w:p>
             <w:r>
@@ -324,17 +531,17 @@
         </w:tc>
         <w:tc>
           <w:tcPr>
-            <w:tcW w:type="dxa" w:w="2880"/>
+            <w:tcW w:type="dxa" w:w="3120"/>
           </w:tcPr>
           <w:p>
             <w:r>
-              <w:t>22577</w:t>
+              <w:t>22,577</w:t>
             </w:r>
           </w:p>
         </w:tc>
         <w:tc>
           <w:tcPr>
-            <w:tcW w:type="dxa" w:w="2880"/>
+            <w:tcW w:type="dxa" w:w="3120"/>
           </w:tcPr>
           <w:p>
             <w:r>
@@ -346,7 +553,7 @@
       <w:tr>
         <w:tc>
           <w:tcPr>
-            <w:tcW w:type="dxa" w:w="2880"/>
+            <w:tcW w:type="dxa" w:w="3120"/>
           </w:tcPr>
           <w:p>
             <w:r>
@@ -356,17 +563,17 @@
         </w:tc>
         <w:tc>
           <w:tcPr>
-            <w:tcW w:type="dxa" w:w="2880"/>
+            <w:tcW w:type="dxa" w:w="3120"/>
           </w:tcPr>
           <w:p>
             <w:r>
-              <w:t>5994</w:t>
+              <w:t>5,994</w:t>
             </w:r>
           </w:p>
         </w:tc>
         <w:tc>
           <w:tcPr>
-            <w:tcW w:type="dxa" w:w="2880"/>
+            <w:tcW w:type="dxa" w:w="3120"/>
           </w:tcPr>
           <w:p>
             <w:r>
@@ -378,7 +585,7 @@
       <w:tr>
         <w:tc>
           <w:tcPr>
-            <w:tcW w:type="dxa" w:w="2880"/>
+            <w:tcW w:type="dxa" w:w="3120"/>
           </w:tcPr>
           <w:p>
             <w:r>
@@ -388,7 +595,7 @@
         </w:tc>
         <w:tc>
           <w:tcPr>
-            <w:tcW w:type="dxa" w:w="2880"/>
+            <w:tcW w:type="dxa" w:w="3120"/>
           </w:tcPr>
           <w:p>
             <w:r>
@@ -398,7 +605,7 @@
         </w:tc>
         <w:tc>
           <w:tcPr>
-            <w:tcW w:type="dxa" w:w="2880"/>
+            <w:tcW w:type="dxa" w:w="3120"/>
           </w:tcPr>
           <w:p>
             <w:r>
@@ -413,19 +620,828 @@
         <w:pStyle w:val="Heading1"/>
       </w:pPr>
       <w:r>
+        <w:t>Data Cleaning and Transformation</w:t>
+      </w:r>
+    </w:p>
+    <w:p>
+      <w:pPr>
+        <w:jc w:val="both"/>
+      </w:pPr>
+      <w:r>
+        <w:t>The raw dataset intentionally contains duplicates, inconsistent capitalization, leading/trailing spaces, invalid marks, null attendance values, text dates, and inconsistent payment labels. Cleaning standardizes text, removes duplicates, converts dates and numeric fields, clamps marks to valid ranges, recalculates payment balances, fills scholarship status correctly, and creates analytical risk categories.</w:t>
+      </w:r>
+    </w:p>
+    <w:p>
+      <w:pPr>
+        <w:pStyle w:val="Heading1"/>
+      </w:pPr>
+      <w:r>
         <w:t>Data Model and Relationships</w:t>
       </w:r>
     </w:p>
     <w:p>
+      <w:pPr>
+        <w:jc w:val="both"/>
+      </w:pPr>
       <w:r>
-        <w:t>The model documents one-to-one Students to StudentProfile, one-to-many department/student/course/faculty/budget and transaction relationships, and the conceptual Students-Courses many-to-many relationship resolved by Enrollment.</w:t>
+        <w:t>The design uses dimension-style tables for Students, StudentProfile, Departments, Courses, Faculty, and Semesters. Enrollment acts as both a fact table and bridge table between Students and Courses. Attendance, Payments, and DepartmentBudget are fact tables. Single-direction filtering is recommended where possible to reduce ambiguity.</w:t>
+      </w:r>
+    </w:p>
+    <w:p>
+      <w:pPr>
+        <w:pStyle w:val="Heading1"/>
+      </w:pPr>
+      <w:r>
+        <w:t>DAX Measures and Calculations</w:t>
+      </w:r>
+    </w:p>
+    <w:p>
+      <w:pPr>
+        <w:jc w:val="both"/>
+      </w:pPr>
+      <w:r>
+        <w:t>The project includes 40 documented DAX measures covering counts, pass/fail rates, attendance risk, payment collection, outstanding amounts, faculty load, growth rates, budget utilization, scholarship rate, ranking, dynamic titles, TOPN, CONCATENATEX, and USERELATIONSHIP examples. Date table DAX and calculated-column examples are also provided.</w:t>
+      </w:r>
+    </w:p>
+    <w:p>
+      <w:pPr>
+        <w:pStyle w:val="Heading1"/>
+      </w:pPr>
+      <w:r>
+        <w:t>Dashboard Development</w:t>
+      </w:r>
+    </w:p>
+    <w:p>
+      <w:pPr>
+        <w:jc w:val="both"/>
+      </w:pPr>
+      <w:r>
+        <w:t>The published interface follows the visual direction of a dark executive dashboard with gold highlights, compact KPI cards, high-contrast panels, and responsive chart containers. The website includes KPI cards, line charts, horizontal bar charts, a doughnut chart, budget table, analytical findings, download links, screenshots, and a demo video.</w:t>
+      </w:r>
+    </w:p>
+    <w:p>
+      <w:pPr>
+        <w:pStyle w:val="Heading1"/>
+      </w:pPr>
+      <w:r>
+        <w:t>Implementation Process</w:t>
+      </w:r>
+    </w:p>
+    <w:p>
+      <w:pPr>
+        <w:jc w:val="both"/>
+      </w:pPr>
+      <w:r>
+        <w:t>Implementation was organized into scripts, data folders, documentation folders, report files, presentation files, screenshots, website source, and release assets. The published site in docs/ reads generated JSON analytics data from the cleaned workbook, ensuring that the displayed figures match the validated dataset.</w:t>
+      </w:r>
+    </w:p>
+    <w:p>
+      <w:pPr>
+        <w:pStyle w:val="Heading1"/>
+      </w:pPr>
+      <w:r>
+        <w:t>Testing and Validation</w:t>
+      </w:r>
+    </w:p>
+    <w:p>
+      <w:pPr>
+        <w:jc w:val="both"/>
+      </w:pPr>
+      <w:r>
+        <w:t>Automated validation checks tested primary-key uniqueness, foreign-key integrity, marks, grade points, attendance percentages, payment calculations, date logic, duplicate identifiers, orphan records, and required columns. The website was tested through direct HTTP requests, desktop screenshots, mobile screenshots, and download-link verification.</w:t>
+      </w:r>
+    </w:p>
+    <w:p>
+      <w:r>
+        <w:t>Table 2. Validation summary</w:t>
+      </w:r>
+    </w:p>
+    <w:tbl>
+      <w:tblPr>
+        <w:tblStyle w:val="TableGrid"/>
+        <w:tblW w:type="auto" w:w="0"/>
+        <w:tblLook w:firstColumn="1" w:firstRow="1" w:lastColumn="0" w:lastRow="0" w:noHBand="0" w:noVBand="1" w:val="04A0"/>
+      </w:tblPr>
+      <w:tblGrid>
+        <w:gridCol w:w="2340"/>
+        <w:gridCol w:w="2340"/>
+        <w:gridCol w:w="2340"/>
+        <w:gridCol w:w="2340"/>
+      </w:tblGrid>
+      <w:tr>
+        <w:tc>
+          <w:tcPr>
+            <w:tcW w:type="dxa" w:w="2340"/>
+          </w:tcPr>
+          <w:p>
+            <w:r>
+              <w:t>Result</w:t>
+            </w:r>
+          </w:p>
+        </w:tc>
+        <w:tc>
+          <w:tcPr>
+            <w:tcW w:type="dxa" w:w="2340"/>
+          </w:tcPr>
+          <w:p>
+            <w:r>
+              <w:t>Checks</w:t>
+            </w:r>
+          </w:p>
+        </w:tc>
+        <w:tc>
+          <w:tcPr>
+            <w:tcW w:type="dxa" w:w="2340"/>
+          </w:tcPr>
+          <w:p>
+            <w:r>
+              <w:t>Failed Checks</w:t>
+            </w:r>
+          </w:p>
+        </w:tc>
+        <w:tc>
+          <w:tcPr>
+            <w:tcW w:type="dxa" w:w="2340"/>
+          </w:tcPr>
+          <w:p>
+            <w:r>
+              <w:t>Evidence</w:t>
+            </w:r>
+          </w:p>
+        </w:tc>
+      </w:tr>
+      <w:tr>
+        <w:tc>
+          <w:tcPr>
+            <w:tcW w:type="dxa" w:w="2340"/>
+          </w:tcPr>
+          <w:p>
+            <w:r>
+              <w:t>Passed</w:t>
+            </w:r>
+          </w:p>
+        </w:tc>
+        <w:tc>
+          <w:tcPr>
+            <w:tcW w:type="dxa" w:w="2340"/>
+          </w:tcPr>
+          <w:p>
+            <w:r>
+              <w:t>36</w:t>
+            </w:r>
+          </w:p>
+        </w:tc>
+        <w:tc>
+          <w:tcPr>
+            <w:tcW w:type="dxa" w:w="2340"/>
+          </w:tcPr>
+          <w:p>
+            <w:r>
+              <w:t>0</w:t>
+            </w:r>
+          </w:p>
+        </w:tc>
+        <w:tc>
+          <w:tcPr>
+            <w:tcW w:type="dxa" w:w="2340"/>
+          </w:tcPr>
+          <w:p>
+            <w:r>
+              <w:t>data/validation/Data_Validation_Results.xlsx</w:t>
+            </w:r>
+          </w:p>
+        </w:tc>
+      </w:tr>
+    </w:tbl>
+    <w:p>
+      <w:pPr>
+        <w:pStyle w:val="Heading1"/>
+      </w:pPr>
+      <w:r>
+        <w:t>Findings and Interpretation</w:t>
+      </w:r>
+    </w:p>
+    <w:p>
+      <w:pPr>
+        <w:jc w:val="both"/>
+      </w:pPr>
+      <w:r>
+        <w:t>The analysis shows enrollment concentration by department, high-volume semester patterns, variation in average marks by department, attendance-performance association, outstanding tuition exposure, budget utilization differences, and scholarship distribution. Findings are interpreted as operational indicators, not causal claims.</w:t>
+      </w:r>
+    </w:p>
+    <w:p>
+      <w:r>
+        <w:t>Table 3. Main analytical findings</w:t>
+      </w:r>
+    </w:p>
+    <w:tbl>
+      <w:tblPr>
+        <w:tblStyle w:val="TableGrid"/>
+        <w:tblW w:type="auto" w:w="0"/>
+        <w:tblLook w:firstColumn="1" w:firstRow="1" w:lastColumn="0" w:lastRow="0" w:noHBand="0" w:noVBand="1" w:val="04A0"/>
+      </w:tblPr>
+      <w:tblGrid>
+        <w:gridCol w:w="2340"/>
+        <w:gridCol w:w="2340"/>
+        <w:gridCol w:w="2340"/>
+        <w:gridCol w:w="2340"/>
+      </w:tblGrid>
+      <w:tr>
+        <w:tc>
+          <w:tcPr>
+            <w:tcW w:type="dxa" w:w="2340"/>
+          </w:tcPr>
+          <w:p>
+            <w:r>
+              <w:t>Finding</w:t>
+            </w:r>
+          </w:p>
+        </w:tc>
+        <w:tc>
+          <w:tcPr>
+            <w:tcW w:type="dxa" w:w="2340"/>
+          </w:tcPr>
+          <w:p>
+            <w:r>
+              <w:t>Observation</w:t>
+            </w:r>
+          </w:p>
+        </w:tc>
+        <w:tc>
+          <w:tcPr>
+            <w:tcW w:type="dxa" w:w="2340"/>
+          </w:tcPr>
+          <w:p>
+            <w:r>
+              <w:t>Recommended Action</w:t>
+            </w:r>
+          </w:p>
+        </w:tc>
+        <w:tc>
+          <w:tcPr>
+            <w:tcW w:type="dxa" w:w="2340"/>
+          </w:tcPr>
+          <w:p>
+            <w:r>
+              <w:t>Limitation</w:t>
+            </w:r>
+          </w:p>
+        </w:tc>
+      </w:tr>
+      <w:tr>
+        <w:tc>
+          <w:tcPr>
+            <w:tcW w:type="dxa" w:w="2340"/>
+          </w:tcPr>
+          <w:p>
+            <w:r>
+              <w:t>Highest enrollment department</w:t>
+            </w:r>
+          </w:p>
+        </w:tc>
+        <w:tc>
+          <w:tcPr>
+            <w:tcW w:type="dxa" w:w="2340"/>
+          </w:tcPr>
+          <w:p>
+            <w:r>
+              <w:t>English has the largest student count.</w:t>
+            </w:r>
+          </w:p>
+        </w:tc>
+        <w:tc>
+          <w:tcPr>
+            <w:tcW w:type="dxa" w:w="2340"/>
+          </w:tcPr>
+          <w:p>
+            <w:r>
+              <w:t>Review section sizes and faculty allocation.</w:t>
+            </w:r>
+          </w:p>
+        </w:tc>
+        <w:tc>
+          <w:tcPr>
+            <w:tcW w:type="dxa" w:w="2340"/>
+          </w:tcPr>
+          <w:p>
+            <w:r>
+              <w:t>Synthetic dataset only.</w:t>
+            </w:r>
+          </w:p>
+        </w:tc>
+      </w:tr>
+      <w:tr>
+        <w:tc>
+          <w:tcPr>
+            <w:tcW w:type="dxa" w:w="2340"/>
+          </w:tcPr>
+          <w:p>
+            <w:r>
+              <w:t>Highest failure course</w:t>
+            </w:r>
+          </w:p>
+        </w:tc>
+        <w:tc>
+          <w:tcPr>
+            <w:tcW w:type="dxa" w:w="2340"/>
+          </w:tcPr>
+          <w:p>
+            <w:r>
+              <w:t>C018 has the highest failure rate.</w:t>
+            </w:r>
+          </w:p>
+        </w:tc>
+        <w:tc>
+          <w:tcPr>
+            <w:tcW w:type="dxa" w:w="2340"/>
+          </w:tcPr>
+          <w:p>
+            <w:r>
+              <w:t>Add tutoring and review course design.</w:t>
+            </w:r>
+          </w:p>
+        </w:tc>
+        <w:tc>
+          <w:tcPr>
+            <w:tcW w:type="dxa" w:w="2340"/>
+          </w:tcPr>
+          <w:p>
+            <w:r>
+              <w:t>Association only, not causation.</w:t>
+            </w:r>
+          </w:p>
+        </w:tc>
+      </w:tr>
+      <w:tr>
+        <w:tc>
+          <w:tcPr>
+            <w:tcW w:type="dxa" w:w="2340"/>
+          </w:tcPr>
+          <w:p>
+            <w:r>
+              <w:t>Attendance relationship</w:t>
+            </w:r>
+          </w:p>
+        </w:tc>
+        <w:tc>
+          <w:tcPr>
+            <w:tcW w:type="dxa" w:w="2340"/>
+          </w:tcPr>
+          <w:p>
+            <w:r>
+              <w:t>Lower attendance bands show lower average final marks.</w:t>
+            </w:r>
+          </w:p>
+        </w:tc>
+        <w:tc>
+          <w:tcPr>
+            <w:tcW w:type="dxa" w:w="2340"/>
+          </w:tcPr>
+          <w:p>
+            <w:r>
+              <w:t>Trigger advising below 75% attendance.</w:t>
+            </w:r>
+          </w:p>
+        </w:tc>
+        <w:tc>
+          <w:tcPr>
+            <w:tcW w:type="dxa" w:w="2340"/>
+          </w:tcPr>
+          <w:p>
+            <w:r>
+              <w:t>Cannot prove attendance causes marks.</w:t>
+            </w:r>
+          </w:p>
+        </w:tc>
+      </w:tr>
+      <w:tr>
+        <w:tc>
+          <w:tcPr>
+            <w:tcW w:type="dxa" w:w="2340"/>
+          </w:tcPr>
+          <w:p>
+            <w:r>
+              <w:t>Outstanding payments</w:t>
+            </w:r>
+          </w:p>
+        </w:tc>
+        <w:tc>
+          <w:tcPr>
+            <w:tcW w:type="dxa" w:w="2340"/>
+          </w:tcPr>
+          <w:p>
+            <w:r>
+              <w:t>Outstanding balance totals 125,733,250.</w:t>
+            </w:r>
+          </w:p>
+        </w:tc>
+        <w:tc>
+          <w:tcPr>
+            <w:tcW w:type="dxa" w:w="2340"/>
+          </w:tcPr>
+          <w:p>
+            <w:r>
+              <w:t>Segment outreach by payment risk level.</w:t>
+            </w:r>
+          </w:p>
+        </w:tc>
+        <w:tc>
+          <w:tcPr>
+            <w:tcW w:type="dxa" w:w="2340"/>
+          </w:tcPr>
+          <w:p>
+            <w:r>
+              <w:t>Synthetic tuition assumptions.</w:t>
+            </w:r>
+          </w:p>
+        </w:tc>
+      </w:tr>
+      <w:tr>
+        <w:tc>
+          <w:tcPr>
+            <w:tcW w:type="dxa" w:w="2340"/>
+          </w:tcPr>
+          <w:p>
+            <w:r>
+              <w:t>Budget utilization</w:t>
+            </w:r>
+          </w:p>
+        </w:tc>
+        <w:tc>
+          <w:tcPr>
+            <w:tcW w:type="dxa" w:w="2340"/>
+          </w:tcPr>
+          <w:p>
+            <w:r>
+              <w:t>D007 has the highest utilization in 2023.</w:t>
+            </w:r>
+          </w:p>
+        </w:tc>
+        <w:tc>
+          <w:tcPr>
+            <w:tcW w:type="dxa" w:w="2340"/>
+          </w:tcPr>
+          <w:p>
+            <w:r>
+              <w:t>Review mid-year budget reallocations.</w:t>
+            </w:r>
+          </w:p>
+        </w:tc>
+        <w:tc>
+          <w:tcPr>
+            <w:tcW w:type="dxa" w:w="2340"/>
+          </w:tcPr>
+          <w:p>
+            <w:r>
+              <w:t>Budget is generated, not actual finance data.</w:t>
+            </w:r>
+          </w:p>
+        </w:tc>
+      </w:tr>
+      <w:tr>
+        <w:tc>
+          <w:tcPr>
+            <w:tcW w:type="dxa" w:w="2340"/>
+          </w:tcPr>
+          <w:p>
+            <w:r>
+              <w:t>Scholarship distribution</w:t>
+            </w:r>
+          </w:p>
+        </w:tc>
+        <w:tc>
+          <w:tcPr>
+            <w:tcW w:type="dxa" w:w="2340"/>
+          </w:tcPr>
+          <w:p>
+            <w:r>
+              <w:t>32.0% of students receive a scholarship.</w:t>
+            </w:r>
+          </w:p>
+        </w:tc>
+        <w:tc>
+          <w:tcPr>
+            <w:tcW w:type="dxa" w:w="2340"/>
+          </w:tcPr>
+          <w:p>
+            <w:r>
+              <w:t>Track outcomes by scholarship type.</w:t>
+            </w:r>
+          </w:p>
+        </w:tc>
+        <w:tc>
+          <w:tcPr>
+            <w:tcW w:type="dxa" w:w="2340"/>
+          </w:tcPr>
+          <w:p>
+            <w:r>
+              <w:t>No real socioeconomic data.</w:t>
+            </w:r>
+          </w:p>
+        </w:tc>
+      </w:tr>
+      <w:tr>
+        <w:tc>
+          <w:tcPr>
+            <w:tcW w:type="dxa" w:w="2340"/>
+          </w:tcPr>
+          <w:p>
+            <w:r>
+              <w:t>Faculty workload</w:t>
+            </w:r>
+          </w:p>
+        </w:tc>
+        <w:tc>
+          <w:tcPr>
+            <w:tcW w:type="dxa" w:w="2340"/>
+          </w:tcPr>
+          <w:p>
+            <w:r>
+              <w:t>Enrollment links faculty to taught courses for workload analysis.</w:t>
+            </w:r>
+          </w:p>
+        </w:tc>
+        <w:tc>
+          <w:tcPr>
+            <w:tcW w:type="dxa" w:w="2340"/>
+          </w:tcPr>
+          <w:p>
+            <w:r>
+              <w:t>Monitor distinct courses and enrollments per faculty.</w:t>
+            </w:r>
+          </w:p>
+        </w:tc>
+        <w:tc>
+          <w:tcPr>
+            <w:tcW w:type="dxa" w:w="2340"/>
+          </w:tcPr>
+          <w:p>
+            <w:r>
+              <w:t>Workload excludes non-teaching duties.</w:t>
+            </w:r>
+          </w:p>
+        </w:tc>
+      </w:tr>
+      <w:tr>
+        <w:tc>
+          <w:tcPr>
+            <w:tcW w:type="dxa" w:w="2340"/>
+          </w:tcPr>
+          <w:p>
+            <w:r>
+              <w:t>Graduation eligibility</w:t>
+            </w:r>
+          </w:p>
+        </w:tc>
+        <w:tc>
+          <w:tcPr>
+            <w:tcW w:type="dxa" w:w="2340"/>
+          </w:tcPr>
+          <w:p>
+            <w:r>
+              <w:t>Credit and GPA measures identify students approaching eligibility.</w:t>
+            </w:r>
+          </w:p>
+        </w:tc>
+        <w:tc>
+          <w:tcPr>
+            <w:tcW w:type="dxa" w:w="2340"/>
+          </w:tcPr>
+          <w:p>
+            <w:r>
+              <w:t>Add drill-through student review page.</w:t>
+            </w:r>
+          </w:p>
+        </w:tc>
+        <w:tc>
+          <w:tcPr>
+            <w:tcW w:type="dxa" w:w="2340"/>
+          </w:tcPr>
+          <w:p>
+            <w:r>
+              <w:t>Eligibility rule is simplified.</w:t>
+            </w:r>
+          </w:p>
+        </w:tc>
+      </w:tr>
+      <w:tr>
+        <w:tc>
+          <w:tcPr>
+            <w:tcW w:type="dxa" w:w="2340"/>
+          </w:tcPr>
+          <w:p>
+            <w:r>
+              <w:t>Payment status</w:t>
+            </w:r>
+          </w:p>
+        </w:tc>
+        <w:tc>
+          <w:tcPr>
+            <w:tcW w:type="dxa" w:w="2340"/>
+          </w:tcPr>
+          <w:p>
+            <w:r>
+              <w:t>Paid, partial, and unpaid categories provide finance risk visibility.</w:t>
+            </w:r>
+          </w:p>
+        </w:tc>
+        <w:tc>
+          <w:tcPr>
+            <w:tcW w:type="dxa" w:w="2340"/>
+          </w:tcPr>
+          <w:p>
+            <w:r>
+              <w:t>Use respectful outreach workflows.</w:t>
+            </w:r>
+          </w:p>
+        </w:tc>
+        <w:tc>
+          <w:tcPr>
+            <w:tcW w:type="dxa" w:w="2340"/>
+          </w:tcPr>
+          <w:p>
+            <w:r>
+              <w:t>Synthetic data includes fictional profiles.</w:t>
+            </w:r>
+          </w:p>
+        </w:tc>
+      </w:tr>
+      <w:tr>
+        <w:tc>
+          <w:tcPr>
+            <w:tcW w:type="dxa" w:w="2340"/>
+          </w:tcPr>
+          <w:p>
+            <w:r>
+              <w:t>Semester trend</w:t>
+            </w:r>
+          </w:p>
+        </w:tc>
+        <w:tc>
+          <w:tcPr>
+            <w:tcW w:type="dxa" w:w="2340"/>
+          </w:tcPr>
+          <w:p>
+            <w:r>
+              <w:t>Semester fields support enrollment and performance trend pages.</w:t>
+            </w:r>
+          </w:p>
+        </w:tc>
+        <w:tc>
+          <w:tcPr>
+            <w:tcW w:type="dxa" w:w="2340"/>
+          </w:tcPr>
+          <w:p>
+            <w:r>
+              <w:t>Monitor semester-over-semester growth.</w:t>
+            </w:r>
+          </w:p>
+        </w:tc>
+        <w:tc>
+          <w:tcPr>
+            <w:tcW w:type="dxa" w:w="2340"/>
+          </w:tcPr>
+          <w:p>
+            <w:r>
+              <w:t>Trend is generated from random distributions.</w:t>
+            </w:r>
+          </w:p>
+        </w:tc>
+      </w:tr>
+    </w:tbl>
+    <w:p>
+      <w:pPr>
+        <w:pStyle w:val="Heading1"/>
+      </w:pPr>
+      <w:r>
+        <w:t>Limitations</w:t>
+      </w:r>
+    </w:p>
+    <w:p>
+      <w:pPr>
+        <w:jc w:val="both"/>
+      </w:pPr>
+      <w:r>
+        <w:t>The dataset is synthetic and cannot be used to infer real university behavior. Power BI Desktop was not installed, so the PBIX file and Power BI Service report were not created. The public analytics viewer is static and does not replace a live Power BI Service report. Further refinement should occur after building the actual PBIX.</w:t>
+      </w:r>
+    </w:p>
+    <w:p>
+      <w:pPr>
+        <w:pStyle w:val="Heading1"/>
+      </w:pPr>
+      <w:r>
+        <w:t>Recommendations</w:t>
+      </w:r>
+    </w:p>
+    <w:p>
+      <w:pPr>
+        <w:jc w:val="both"/>
+      </w:pPr>
+      <w:r>
+        <w:t>Future work should build and publish the PBIX in Power BI Desktop, add real Power BI screenshots, configure data refresh, enhance drill-through pages, include accessibility testing with screen readers, and refine measures after stakeholder feedback. Academic teams should use attendance and payment risk categories as early-warning indicators.</w:t>
+      </w:r>
+    </w:p>
+    <w:p>
+      <w:pPr>
+        <w:pStyle w:val="Heading1"/>
+      </w:pPr>
+      <w:r>
+        <w:t>Conclusion</w:t>
+      </w:r>
+    </w:p>
+    <w:p>
+      <w:pPr>
+        <w:jc w:val="both"/>
+      </w:pPr>
+      <w:r>
+        <w:t>The final submission provides a comprehensive, validated, and publicly accessible analytics project package. It demonstrates relational modeling, data cleaning, validation, DAX planning, Power Query documentation, reporting design, public deployment, and academic documentation while clearly distinguishing completed artifacts from environment-limited Power BI tasks.</w:t>
+      </w:r>
+    </w:p>
+    <w:p>
+      <w:pPr>
+        <w:pStyle w:val="Heading1"/>
+      </w:pPr>
+      <w:r>
+        <w:t>References</w:t>
+      </w:r>
+    </w:p>
+    <w:p>
+      <w:pPr>
+        <w:jc w:val="both"/>
+      </w:pPr>
+      <w:r>
+        <w:t>Microsoft. (2026). Power BI documentation. Microsoft Learn.</w:t>
+      </w:r>
+    </w:p>
+    <w:p>
+      <w:pPr>
+        <w:jc w:val="both"/>
+      </w:pPr>
+      <w:r>
+        <w:t>Microsoft. (2026). DAX function reference. Microsoft Learn.</w:t>
+      </w:r>
+    </w:p>
+    <w:p>
+      <w:pPr>
+        <w:jc w:val="both"/>
+      </w:pPr>
+      <w:r>
+        <w:t>Microsoft. (2026). Power Query M language specification. Microsoft Learn.</w:t>
+      </w:r>
+    </w:p>
+    <w:p>
+      <w:pPr>
+        <w:jc w:val="both"/>
+      </w:pPr>
+      <w:r>
+        <w:t>GitHub. (2026). GitHub Pages documentation. GitHub Docs.</w:t>
+      </w:r>
+    </w:p>
+    <w:p>
+      <w:pPr>
+        <w:jc w:val="both"/>
+      </w:pPr>
+      <w:r>
+        <w:t>Python Software Foundation. (2026). Python documentation.</w:t>
+      </w:r>
+    </w:p>
+    <w:p>
+      <w:pPr>
+        <w:jc w:val="both"/>
+      </w:pPr>
+      <w:r>
+        <w:t>Project dataset and visualizations are synthetically generated by the author for academic demonstration.</w:t>
+      </w:r>
+    </w:p>
+    <w:p>
+      <w:pPr>
+        <w:pStyle w:val="Heading1"/>
+      </w:pPr>
+      <w:r>
+        <w:t>Appendices</w:t>
+      </w:r>
+    </w:p>
+    <w:p>
+      <w:pPr>
+        <w:jc w:val="both"/>
+      </w:pPr>
+      <w:r>
+        <w:t>Appendix A: DAX_Measures.md. Appendix B: Power_Query_M_Code.md. Appendix C: Date_Table_DAX.md. Appendix D: Relationship_Documentation.md. Appendix E: Prompt_Compliance_Cross_Check.md. Repository: https://github.com/Monokayser/University-PowerBI-Analytics. Published viewer: https://monokayser.github.io/University-PowerBI-Analytics/. Demo: https://monokayser.github.io/University-PowerBI-Analytics/demo.html. Release: https://github.com/Monokayser/University-PowerBI-Analytics/releases/tag/v1.1.0.</w:t>
+      </w:r>
+    </w:p>
+    <w:p>
+      <w:pPr>
+        <w:pStyle w:val="Heading2"/>
+      </w:pPr>
+      <w:r>
+        <w:t>Figure 1. Enrollment trend by semester</w:t>
       </w:r>
     </w:p>
     <w:p>
       <w:r>
         <w:drawing>
           <wp:inline xmlns:a="http://schemas.openxmlformats.org/drawingml/2006/main" xmlns:pic="http://schemas.openxmlformats.org/drawingml/2006/picture">
-            <wp:extent cx="5669280" cy="3644537"/>
+            <wp:extent cx="5852160" cy="3511296"/>
             <wp:docPr id="1" name="Picture 1"/>
             <wp:cNvGraphicFramePr>
               <a:graphicFrameLocks noChangeAspect="1"/>
@@ -434,7 +1450,7 @@
               <a:graphicData uri="http://schemas.openxmlformats.org/drawingml/2006/picture">
                 <pic:pic>
                   <pic:nvPicPr>
-                    <pic:cNvPr id="0" name="Data_Model_Diagram.png"/>
+                    <pic:cNvPr id="0" name="figure_01_enrollment_trend.png"/>
                     <pic:cNvPicPr/>
                   </pic:nvPicPr>
                   <pic:blipFill>
@@ -446,7 +1462,7 @@
                   <pic:spPr>
                     <a:xfrm>
                       <a:off x="0" y="0"/>
-                      <a:ext cx="5669280" cy="3644537"/>
+                      <a:ext cx="5852160" cy="3511296"/>
                     </a:xfrm>
                     <a:prstGeom prst="rect"/>
                   </pic:spPr>
@@ -458,16 +1474,454 @@
       </w:r>
     </w:p>
     <w:p>
+      <w:r>
+        <w:t>Figure 1. Enrollment trend by semester</w:t>
+      </w:r>
+    </w:p>
+    <w:p>
       <w:pPr>
-        <w:pStyle w:val="Heading1"/>
+        <w:pStyle w:val="Heading2"/>
       </w:pPr>
       <w:r>
-        <w:t>Power Query and DAX</w:t>
+        <w:t>Figure 2. Students by department</w:t>
       </w:r>
     </w:p>
     <w:p>
       <w:r>
-        <w:t>Power Query transformations are documented table-by-table in powerbi/Power_Query_M_Code.md. The project includes 40 DAX measures, Date table DAX, and calculated-column examples.</w:t>
+        <w:drawing>
+          <wp:inline xmlns:a="http://schemas.openxmlformats.org/drawingml/2006/main" xmlns:pic="http://schemas.openxmlformats.org/drawingml/2006/picture">
+            <wp:extent cx="5852160" cy="3511296"/>
+            <wp:docPr id="2" name="Picture 2"/>
+            <wp:cNvGraphicFramePr>
+              <a:graphicFrameLocks noChangeAspect="1"/>
+            </wp:cNvGraphicFramePr>
+            <a:graphic>
+              <a:graphicData uri="http://schemas.openxmlformats.org/drawingml/2006/picture">
+                <pic:pic>
+                  <pic:nvPicPr>
+                    <pic:cNvPr id="0" name="figure_02_students_by_department.png"/>
+                    <pic:cNvPicPr/>
+                  </pic:nvPicPr>
+                  <pic:blipFill>
+                    <a:blip r:embed="rId10"/>
+                    <a:stretch>
+                      <a:fillRect/>
+                    </a:stretch>
+                  </pic:blipFill>
+                  <pic:spPr>
+                    <a:xfrm>
+                      <a:off x="0" y="0"/>
+                      <a:ext cx="5852160" cy="3511296"/>
+                    </a:xfrm>
+                    <a:prstGeom prst="rect"/>
+                  </pic:spPr>
+                </pic:pic>
+              </a:graphicData>
+            </a:graphic>
+          </wp:inline>
+        </w:drawing>
+      </w:r>
+    </w:p>
+    <w:p>
+      <w:r>
+        <w:t>Figure 2. Students by department</w:t>
+      </w:r>
+    </w:p>
+    <w:p>
+      <w:pPr>
+        <w:pStyle w:val="Heading2"/>
+      </w:pPr>
+      <w:r>
+        <w:t>Figure 3. Average final mark by department</w:t>
+      </w:r>
+    </w:p>
+    <w:p>
+      <w:r>
+        <w:drawing>
+          <wp:inline xmlns:a="http://schemas.openxmlformats.org/drawingml/2006/main" xmlns:pic="http://schemas.openxmlformats.org/drawingml/2006/picture">
+            <wp:extent cx="5852160" cy="3511296"/>
+            <wp:docPr id="3" name="Picture 3"/>
+            <wp:cNvGraphicFramePr>
+              <a:graphicFrameLocks noChangeAspect="1"/>
+            </wp:cNvGraphicFramePr>
+            <a:graphic>
+              <a:graphicData uri="http://schemas.openxmlformats.org/drawingml/2006/picture">
+                <pic:pic>
+                  <pic:nvPicPr>
+                    <pic:cNvPr id="0" name="figure_03_average_mark_department.png"/>
+                    <pic:cNvPicPr/>
+                  </pic:nvPicPr>
+                  <pic:blipFill>
+                    <a:blip r:embed="rId11"/>
+                    <a:stretch>
+                      <a:fillRect/>
+                    </a:stretch>
+                  </pic:blipFill>
+                  <pic:spPr>
+                    <a:xfrm>
+                      <a:off x="0" y="0"/>
+                      <a:ext cx="5852160" cy="3511296"/>
+                    </a:xfrm>
+                    <a:prstGeom prst="rect"/>
+                  </pic:spPr>
+                </pic:pic>
+              </a:graphicData>
+            </a:graphic>
+          </wp:inline>
+        </w:drawing>
+      </w:r>
+    </w:p>
+    <w:p>
+      <w:r>
+        <w:t>Figure 3. Average final mark by department</w:t>
+      </w:r>
+    </w:p>
+    <w:p>
+      <w:pPr>
+        <w:pStyle w:val="Heading2"/>
+      </w:pPr>
+      <w:r>
+        <w:t>Figure 4. Outstanding fees by department</w:t>
+      </w:r>
+    </w:p>
+    <w:p>
+      <w:r>
+        <w:drawing>
+          <wp:inline xmlns:a="http://schemas.openxmlformats.org/drawingml/2006/main" xmlns:pic="http://schemas.openxmlformats.org/drawingml/2006/picture">
+            <wp:extent cx="5852160" cy="3511296"/>
+            <wp:docPr id="4" name="Picture 4"/>
+            <wp:cNvGraphicFramePr>
+              <a:graphicFrameLocks noChangeAspect="1"/>
+            </wp:cNvGraphicFramePr>
+            <a:graphic>
+              <a:graphicData uri="http://schemas.openxmlformats.org/drawingml/2006/picture">
+                <pic:pic>
+                  <pic:nvPicPr>
+                    <pic:cNvPr id="0" name="figure_04_outstanding_by_department.png"/>
+                    <pic:cNvPicPr/>
+                  </pic:nvPicPr>
+                  <pic:blipFill>
+                    <a:blip r:embed="rId12"/>
+                    <a:stretch>
+                      <a:fillRect/>
+                    </a:stretch>
+                  </pic:blipFill>
+                  <pic:spPr>
+                    <a:xfrm>
+                      <a:off x="0" y="0"/>
+                      <a:ext cx="5852160" cy="3511296"/>
+                    </a:xfrm>
+                    <a:prstGeom prst="rect"/>
+                  </pic:spPr>
+                </pic:pic>
+              </a:graphicData>
+            </a:graphic>
+          </wp:inline>
+        </w:drawing>
+      </w:r>
+    </w:p>
+    <w:p>
+      <w:r>
+        <w:t>Figure 4. Outstanding fees by department</w:t>
+      </w:r>
+    </w:p>
+    <w:p>
+      <w:pPr>
+        <w:pStyle w:val="Heading2"/>
+      </w:pPr>
+      <w:r>
+        <w:t>Figure 5. Budget utilization by department</w:t>
+      </w:r>
+    </w:p>
+    <w:p>
+      <w:r>
+        <w:drawing>
+          <wp:inline xmlns:a="http://schemas.openxmlformats.org/drawingml/2006/main" xmlns:pic="http://schemas.openxmlformats.org/drawingml/2006/picture">
+            <wp:extent cx="5852160" cy="3511296"/>
+            <wp:docPr id="5" name="Picture 5"/>
+            <wp:cNvGraphicFramePr>
+              <a:graphicFrameLocks noChangeAspect="1"/>
+            </wp:cNvGraphicFramePr>
+            <a:graphic>
+              <a:graphicData uri="http://schemas.openxmlformats.org/drawingml/2006/picture">
+                <pic:pic>
+                  <pic:nvPicPr>
+                    <pic:cNvPr id="0" name="figure_05_budget_utilization.png"/>
+                    <pic:cNvPicPr/>
+                  </pic:nvPicPr>
+                  <pic:blipFill>
+                    <a:blip r:embed="rId13"/>
+                    <a:stretch>
+                      <a:fillRect/>
+                    </a:stretch>
+                  </pic:blipFill>
+                  <pic:spPr>
+                    <a:xfrm>
+                      <a:off x="0" y="0"/>
+                      <a:ext cx="5852160" cy="3511296"/>
+                    </a:xfrm>
+                    <a:prstGeom prst="rect"/>
+                  </pic:spPr>
+                </pic:pic>
+              </a:graphicData>
+            </a:graphic>
+          </wp:inline>
+        </w:drawing>
+      </w:r>
+    </w:p>
+    <w:p>
+      <w:r>
+        <w:t>Figure 5. Budget utilization by department</w:t>
+      </w:r>
+    </w:p>
+    <w:p>
+      <w:pPr>
+        <w:pStyle w:val="Heading2"/>
+      </w:pPr>
+      <w:r>
+        <w:t>Figure 6. System architecture and publication workflow</w:t>
+      </w:r>
+    </w:p>
+    <w:p>
+      <w:r>
+        <w:drawing>
+          <wp:inline xmlns:a="http://schemas.openxmlformats.org/drawingml/2006/main" xmlns:pic="http://schemas.openxmlformats.org/drawingml/2006/picture">
+            <wp:extent cx="5852160" cy="3176887"/>
+            <wp:docPr id="6" name="Picture 6"/>
+            <wp:cNvGraphicFramePr>
+              <a:graphicFrameLocks noChangeAspect="1"/>
+            </wp:cNvGraphicFramePr>
+            <a:graphic>
+              <a:graphicData uri="http://schemas.openxmlformats.org/drawingml/2006/picture">
+                <pic:pic>
+                  <pic:nvPicPr>
+                    <pic:cNvPr id="0" name="figure_06_system_architecture.png"/>
+                    <pic:cNvPicPr/>
+                  </pic:nvPicPr>
+                  <pic:blipFill>
+                    <a:blip r:embed="rId14"/>
+                    <a:stretch>
+                      <a:fillRect/>
+                    </a:stretch>
+                  </pic:blipFill>
+                  <pic:spPr>
+                    <a:xfrm>
+                      <a:off x="0" y="0"/>
+                      <a:ext cx="5852160" cy="3176887"/>
+                    </a:xfrm>
+                    <a:prstGeom prst="rect"/>
+                  </pic:spPr>
+                </pic:pic>
+              </a:graphicData>
+            </a:graphic>
+          </wp:inline>
+        </w:drawing>
+      </w:r>
+    </w:p>
+    <w:p>
+      <w:r>
+        <w:t>Figure 6. System architecture and publication workflow</w:t>
+      </w:r>
+    </w:p>
+    <w:p>
+      <w:pPr>
+        <w:pStyle w:val="Heading2"/>
+      </w:pPr>
+      <w:r>
+        <w:t>Figure 7. Data-processing flowchart</w:t>
+      </w:r>
+    </w:p>
+    <w:p>
+      <w:r>
+        <w:drawing>
+          <wp:inline xmlns:a="http://schemas.openxmlformats.org/drawingml/2006/main" xmlns:pic="http://schemas.openxmlformats.org/drawingml/2006/picture">
+            <wp:extent cx="5852160" cy="3176887"/>
+            <wp:docPr id="7" name="Picture 7"/>
+            <wp:cNvGraphicFramePr>
+              <a:graphicFrameLocks noChangeAspect="1"/>
+            </wp:cNvGraphicFramePr>
+            <a:graphic>
+              <a:graphicData uri="http://schemas.openxmlformats.org/drawingml/2006/picture">
+                <pic:pic>
+                  <pic:nvPicPr>
+                    <pic:cNvPr id="0" name="figure_07_data_processing_flow.png"/>
+                    <pic:cNvPicPr/>
+                  </pic:nvPicPr>
+                  <pic:blipFill>
+                    <a:blip r:embed="rId15"/>
+                    <a:stretch>
+                      <a:fillRect/>
+                    </a:stretch>
+                  </pic:blipFill>
+                  <pic:spPr>
+                    <a:xfrm>
+                      <a:off x="0" y="0"/>
+                      <a:ext cx="5852160" cy="3176887"/>
+                    </a:xfrm>
+                    <a:prstGeom prst="rect"/>
+                  </pic:spPr>
+                </pic:pic>
+              </a:graphicData>
+            </a:graphic>
+          </wp:inline>
+        </w:drawing>
+      </w:r>
+    </w:p>
+    <w:p>
+      <w:r>
+        <w:t>Figure 7. Data-processing flowchart</w:t>
+      </w:r>
+    </w:p>
+    <w:p>
+      <w:pPr>
+        <w:pStyle w:val="Heading2"/>
+      </w:pPr>
+      <w:r>
+        <w:t>Figure 8. Data model diagram</w:t>
+      </w:r>
+    </w:p>
+    <w:p>
+      <w:r>
+        <w:drawing>
+          <wp:inline xmlns:a="http://schemas.openxmlformats.org/drawingml/2006/main" xmlns:pic="http://schemas.openxmlformats.org/drawingml/2006/picture">
+            <wp:extent cx="5852160" cy="3762103"/>
+            <wp:docPr id="8" name="Picture 8"/>
+            <wp:cNvGraphicFramePr>
+              <a:graphicFrameLocks noChangeAspect="1"/>
+            </wp:cNvGraphicFramePr>
+            <a:graphic>
+              <a:graphicData uri="http://schemas.openxmlformats.org/drawingml/2006/picture">
+                <pic:pic>
+                  <pic:nvPicPr>
+                    <pic:cNvPr id="0" name="figure_08_data_model_diagram.png"/>
+                    <pic:cNvPicPr/>
+                  </pic:nvPicPr>
+                  <pic:blipFill>
+                    <a:blip r:embed="rId16"/>
+                    <a:stretch>
+                      <a:fillRect/>
+                    </a:stretch>
+                  </pic:blipFill>
+                  <pic:spPr>
+                    <a:xfrm>
+                      <a:off x="0" y="0"/>
+                      <a:ext cx="5852160" cy="3762103"/>
+                    </a:xfrm>
+                    <a:prstGeom prst="rect"/>
+                  </pic:spPr>
+                </pic:pic>
+              </a:graphicData>
+            </a:graphic>
+          </wp:inline>
+        </w:drawing>
+      </w:r>
+    </w:p>
+    <w:p>
+      <w:r>
+        <w:t>Figure 8. Data model diagram</w:t>
+      </w:r>
+    </w:p>
+    <w:p>
+      <w:pPr>
+        <w:pStyle w:val="Heading2"/>
+      </w:pPr>
+      <w:r>
+        <w:t>Figure 9. Published dashboard screenshot</w:t>
+      </w:r>
+    </w:p>
+    <w:p>
+      <w:r>
+        <w:drawing>
+          <wp:inline xmlns:a="http://schemas.openxmlformats.org/drawingml/2006/main" xmlns:pic="http://schemas.openxmlformats.org/drawingml/2006/picture">
+            <wp:extent cx="5852160" cy="4876800"/>
+            <wp:docPr id="9" name="Picture 9"/>
+            <wp:cNvGraphicFramePr>
+              <a:graphicFrameLocks noChangeAspect="1"/>
+            </wp:cNvGraphicFramePr>
+            <a:graphic>
+              <a:graphicData uri="http://schemas.openxmlformats.org/drawingml/2006/picture">
+                <pic:pic>
+                  <pic:nvPicPr>
+                    <pic:cNvPr id="0" name="desktop_ui_check.png"/>
+                    <pic:cNvPicPr/>
+                  </pic:nvPicPr>
+                  <pic:blipFill>
+                    <a:blip r:embed="rId17"/>
+                    <a:stretch>
+                      <a:fillRect/>
+                    </a:stretch>
+                  </pic:blipFill>
+                  <pic:spPr>
+                    <a:xfrm>
+                      <a:off x="0" y="0"/>
+                      <a:ext cx="5852160" cy="4876800"/>
+                    </a:xfrm>
+                    <a:prstGeom prst="rect"/>
+                  </pic:spPr>
+                </pic:pic>
+              </a:graphicData>
+            </a:graphic>
+          </wp:inline>
+        </w:drawing>
+      </w:r>
+    </w:p>
+    <w:p>
+      <w:r>
+        <w:t>Figure 9. Published dashboard screenshot</w:t>
+      </w:r>
+    </w:p>
+    <w:p>
+      <w:pPr>
+        <w:pStyle w:val="Heading2"/>
+      </w:pPr>
+      <w:r>
+        <w:t>Figure 10. Mobile dashboard screenshot</w:t>
+      </w:r>
+    </w:p>
+    <w:p>
+      <w:r>
+        <w:drawing>
+          <wp:inline xmlns:a="http://schemas.openxmlformats.org/drawingml/2006/main" xmlns:pic="http://schemas.openxmlformats.org/drawingml/2006/picture">
+            <wp:extent cx="5852160" cy="18006646"/>
+            <wp:docPr id="10" name="Picture 10"/>
+            <wp:cNvGraphicFramePr>
+              <a:graphicFrameLocks noChangeAspect="1"/>
+            </wp:cNvGraphicFramePr>
+            <a:graphic>
+              <a:graphicData uri="http://schemas.openxmlformats.org/drawingml/2006/picture">
+                <pic:pic>
+                  <pic:nvPicPr>
+                    <pic:cNvPr id="0" name="mobile_ui_check.png"/>
+                    <pic:cNvPicPr/>
+                  </pic:nvPicPr>
+                  <pic:blipFill>
+                    <a:blip r:embed="rId18"/>
+                    <a:stretch>
+                      <a:fillRect/>
+                    </a:stretch>
+                  </pic:blipFill>
+                  <pic:spPr>
+                    <a:xfrm>
+                      <a:off x="0" y="0"/>
+                      <a:ext cx="5852160" cy="18006646"/>
+                    </a:xfrm>
+                    <a:prstGeom prst="rect"/>
+                  </pic:spPr>
+                </pic:pic>
+              </a:graphicData>
+            </a:graphic>
+          </wp:inline>
+        </w:drawing>
+      </w:r>
+    </w:p>
+    <w:p>
+      <w:r>
+        <w:t>Figure 10. Mobile dashboard screenshot</w:t>
+      </w:r>
+    </w:p>
+    <w:p>
+      <w:r>
+        <w:br w:type="page"/>
       </w:r>
     </w:p>
     <w:p>
@@ -475,111 +1929,25 @@
         <w:pStyle w:val="Heading1"/>
       </w:pPr>
       <w:r>
-        <w:t>Published Analytics</w:t>
+        <w:t>Power BI Publication Limitation and Academic Integrity Note</w:t>
+      </w:r>
+    </w:p>
+    <w:p>
+      <w:pPr>
+        <w:spacing w:after="200"/>
+      </w:pPr>
+      <w:r>
+        <w:t>Power BI Desktop and Power BI Service publishing access were not available in the automated build environment used for this repository update. For this reason, the project does not claim a fabricated .pbix file, Power BI Service URL, app URL, public embed link, or authenticated service screenshot. The repository instead provides the cleaned workbook, DAX measure library, Power Query guidance, relationship documentation, dashboard specifications, a static published analytics viewer, and verification screenshots. These materials allow the report to be reproduced accurately in Power BI Desktop when the required Microsoft Power BI environment is available.</w:t>
       </w:r>
     </w:p>
     <w:p>
       <w:r>
-        <w:t>The public analytics viewer is available at https://monokayser.github.io/University-PowerBI-Analytics/ and the demo video is linked from docs/demo.html. This viewer is generated from cleaned data and is not a fabricated Power BI Service report.</w:t>
-      </w:r>
-    </w:p>
-    <w:p>
-      <w:pPr>
-        <w:pStyle w:val="Heading1"/>
-      </w:pPr>
-      <w:r>
-        <w:t>Main Findings</w:t>
-      </w:r>
-    </w:p>
-    <w:p>
-      <w:r>
-        <w:t>Highest enrollment department: English has the largest student count. Recommended action: Review section sizes and faculty allocation.</w:t>
-      </w:r>
-    </w:p>
-    <w:p>
-      <w:r>
-        <w:t>Highest failure course: C018 has the highest failure rate. Recommended action: Add tutoring and review course design.</w:t>
-      </w:r>
-    </w:p>
-    <w:p>
-      <w:r>
-        <w:t>Attendance relationship: Lower attendance bands show lower average final marks. Recommended action: Trigger advising below 75% attendance.</w:t>
-      </w:r>
-    </w:p>
-    <w:p>
-      <w:r>
-        <w:t>Outstanding payments: Outstanding balance totals 125,733,250. Recommended action: Segment outreach by payment risk level.</w:t>
-      </w:r>
-    </w:p>
-    <w:p>
-      <w:r>
-        <w:t>Budget utilization: D007 has the highest utilization in 2023. Recommended action: Review mid-year budget reallocations.</w:t>
-      </w:r>
-    </w:p>
-    <w:p>
-      <w:r>
-        <w:t>Scholarship distribution: 32.0% of students receive a scholarship. Recommended action: Track outcomes by scholarship type.</w:t>
-      </w:r>
-    </w:p>
-    <w:p>
-      <w:r>
-        <w:t>Faculty workload: Enrollment links faculty to taught courses for workload analysis. Recommended action: Monitor distinct courses and enrollments per faculty.</w:t>
-      </w:r>
-    </w:p>
-    <w:p>
-      <w:r>
-        <w:t>Graduation eligibility: Credit and GPA measures identify students approaching eligibility. Recommended action: Add drill-through student review page.</w:t>
-      </w:r>
-    </w:p>
-    <w:p>
-      <w:r>
-        <w:t>Payment status: Paid, partial, and unpaid categories provide finance risk visibility. Recommended action: Use respectful outreach workflows.</w:t>
-      </w:r>
-    </w:p>
-    <w:p>
-      <w:r>
-        <w:t>Semester trend: Semester fields support enrollment and performance trend pages. Recommended action: Monitor semester-over-semester growth.</w:t>
-      </w:r>
-    </w:p>
-    <w:p>
-      <w:pPr>
-        <w:pStyle w:val="Heading1"/>
-      </w:pPr>
-      <w:r>
-        <w:t>Limitations</w:t>
-      </w:r>
-    </w:p>
-    <w:p>
-      <w:r>
-        <w:t>Power BI Desktop was not installed, so a genuine .pbix file and Power BI Service report could not be created. The published analytics viewer is static and all data is synthetic.</w:t>
-      </w:r>
-    </w:p>
-    <w:p>
-      <w:pPr>
-        <w:pStyle w:val="Heading1"/>
-      </w:pPr>
-      <w:r>
-        <w:t>Repository and Release</w:t>
-      </w:r>
-    </w:p>
-    <w:p>
-      <w:r>
-        <w:t>Repository: https://github.com/Monokayser/University-PowerBI-Analytics</w:t>
-      </w:r>
-    </w:p>
-    <w:p>
-      <w:r>
-        <w:t>Release: https://github.com/Monokayser/University-PowerBI-Analytics/releases/tag/v1.1.0</w:t>
-      </w:r>
-    </w:p>
-    <w:p>
-      <w:r>
-        <w:t>Published viewer: https://monokayser.github.io/University-PowerBI-Analytics/</w:t>
+        <w:t>Verification evidence: the static analytics viewer, downloadable report, cleaned dataset, screenshots, demo video, and release package were tested through the local site and GitHub Pages workflow. Dataset validation passed with no failed validation rules.</w:t>
       </w:r>
     </w:p>
     <w:sectPr>
       <w:pgSz w:w="12240" w:h="15840"/>
-      <w:pgMar w:top="1440" w:right="1800" w:bottom="1440" w:left="1800" w:header="720" w:footer="720" w:gutter="0"/>
+      <w:pgMar w:top="1440" w:right="1440" w:bottom="1440" w:left="1440" w:header="720" w:footer="720" w:gutter="0"/>
       <w:cols w:space="720"/>
       <w:docGrid w:linePitch="360"/>
     </w:sectPr>

</xml_diff>